<commit_message>
fix api other and signature
</commit_message>
<xml_diff>
--- a/resources/Ve_VN_Air.docx
+++ b/resources/Ve_VN_Air.docx
@@ -1,18 +1,20 @@
 
 <file path=word/document.xml><?xml version="1.0" encoding="utf-8"?>
-<w:document xmlns:mc="http://schemas.openxmlformats.org/markup-compatibility/2006" xmlns:ve="http://schemas.openxmlformats.org/markup-compatibility/2006" xmlns:o="urn:schemas-microsoft-com:office:office" xmlns:r="http://schemas.openxmlformats.org/officeDocument/2006/relationships" xmlns:m="http://schemas.openxmlformats.org/officeDocument/2006/math" xmlns:v="urn:schemas-microsoft-com:vml" xmlns:wp="http://schemas.openxmlformats.org/drawingml/2006/wordprocessingDrawing" xmlns:w10="urn:schemas-microsoft-com:office:word" xmlns:w="http://schemas.openxmlformats.org/wordprocessingml/2006/main" xmlns:wne="http://schemas.microsoft.com/office/word/2006/wordml" xmlns:a="http://schemas.openxmlformats.org/drawingml/2006/main" xmlns:pic="http://schemas.openxmlformats.org/drawingml/2006/picture" xmlns:wpg="http://schemas.microsoft.com/office/word/2010/wordprocessingGroup" xmlns:wps="http://schemas.microsoft.com/office/word/2010/wordprocessingShape" xmlns:w14="http://schemas.microsoft.com/office/word/2010/wordml" mc:Ignorable="w14" xml:space="preserve">
+<w:document xmlns:wpc="http://schemas.microsoft.com/office/word/2010/wordprocessingCanvas" xmlns:cx="http://schemas.microsoft.com/office/drawing/2014/chartex" xmlns:cx1="http://schemas.microsoft.com/office/drawing/2015/9/8/chartex" xmlns:cx2="http://schemas.microsoft.com/office/drawing/2015/10/21/chartex" xmlns:cx3="http://schemas.microsoft.com/office/drawing/2016/5/9/chartex" xmlns:cx4="http://schemas.microsoft.com/office/drawing/2016/5/10/chartex" xmlns:cx5="http://schemas.microsoft.com/office/drawing/2016/5/11/chartex" xmlns:cx6="http://schemas.microsoft.com/office/drawing/2016/5/12/chartex" xmlns:cx7="http://schemas.microsoft.com/office/drawing/2016/5/13/chartex" xmlns:cx8="http://schemas.microsoft.com/office/drawing/2016/5/14/chartex" xmlns:mc="http://schemas.openxmlformats.org/markup-compatibility/2006" xmlns:aink="http://schemas.microsoft.com/office/drawing/2016/ink" xmlns:am3d="http://schemas.microsoft.com/office/drawing/2017/model3d" xmlns:o="urn:schemas-microsoft-com:office:office" xmlns:oel="http://schemas.microsoft.com/office/2019/extlst" xmlns:r="http://schemas.openxmlformats.org/officeDocument/2006/relationships" xmlns:m="http://schemas.openxmlformats.org/officeDocument/2006/math" xmlns:v="urn:schemas-microsoft-com:vml" xmlns:wp14="http://schemas.microsoft.com/office/word/2010/wordprocessingDrawing" xmlns:wp="http://schemas.openxmlformats.org/drawingml/2006/wordprocessingDrawing" xmlns:w10="urn:schemas-microsoft-com:office:word" xmlns:w="http://schemas.openxmlformats.org/wordprocessingml/2006/main" xmlns:w14="http://schemas.microsoft.com/office/word/2010/wordml" xmlns:w15="http://schemas.microsoft.com/office/word/2012/wordml" xmlns:w16cex="http://schemas.microsoft.com/office/word/2018/wordml/cex" xmlns:w16cid="http://schemas.microsoft.com/office/word/2016/wordml/cid" xmlns:w16="http://schemas.microsoft.com/office/word/2018/wordml" xmlns:w16du="http://schemas.microsoft.com/office/word/2023/wordml/word16du" xmlns:w16sdtdh="http://schemas.microsoft.com/office/word/2020/wordml/sdtdatahash" xmlns:w16sdtfl="http://schemas.microsoft.com/office/word/2024/wordml/sdtformatlock" xmlns:w16se="http://schemas.microsoft.com/office/word/2015/wordml/symex" xmlns:wpg="http://schemas.microsoft.com/office/word/2010/wordprocessingGroup" xmlns:wpi="http://schemas.microsoft.com/office/word/2010/wordprocessingInk" xmlns:wne="http://schemas.microsoft.com/office/word/2006/wordml" xmlns:wps="http://schemas.microsoft.com/office/word/2010/wordprocessingShape" mc:Ignorable="w14 w15 w16se w16cid w16 w16cex w16sdtdh w16sdtfl w16du wp14">
   <w:body>
     <w:p>
       <w:pPr>
         <w:pStyle w:val="Title"/>
         <w:tabs>
-          <w:tab w:pos="2215" w:val="left" w:leader="none"/>
+          <w:tab w:val="left" w:pos="2215"/>
         </w:tabs>
       </w:pPr>
       <w:r>
-        <w:rPr/>
+        <w:rPr>
+          <w:noProof/>
+        </w:rPr>
         <w:drawing>
-          <wp:anchor distT="0" distB="0" distL="0" distR="0" allowOverlap="1" layoutInCell="1" locked="0" behindDoc="1" simplePos="0" relativeHeight="487484416">
+          <wp:anchor distT="0" distB="0" distL="0" distR="0" simplePos="0" relativeHeight="487484416" behindDoc="1" locked="0" layoutInCell="1" allowOverlap="1" wp14:anchorId="1DA13BDC" wp14:editId="4D8222A4">
             <wp:simplePos x="0" y="0"/>
             <wp:positionH relativeFrom="page">
               <wp:posOffset>1514475</wp:posOffset>
@@ -25,17 +27,17 @@
             <wp:wrapNone/>
             <wp:docPr id="1" name="Image 1"/>
             <wp:cNvGraphicFramePr>
-              <a:graphicFrameLocks/>
+              <a:graphicFrameLocks xmlns:a="http://schemas.openxmlformats.org/drawingml/2006/main"/>
             </wp:cNvGraphicFramePr>
-            <a:graphic>
+            <a:graphic xmlns:a="http://schemas.openxmlformats.org/drawingml/2006/main">
               <a:graphicData uri="http://schemas.openxmlformats.org/drawingml/2006/picture">
-                <pic:pic>
+                <pic:pic xmlns:pic="http://schemas.openxmlformats.org/drawingml/2006/picture">
                   <pic:nvPicPr>
                     <pic:cNvPr id="1" name="Image 1"/>
                     <pic:cNvPicPr/>
                   </pic:nvPicPr>
                   <pic:blipFill>
-                    <a:blip r:embed="rId5" cstate="print"/>
+                    <a:blip r:embed="rId4" cstate="print"/>
                     <a:stretch>
                       <a:fillRect/>
                     </a:stretch>
@@ -56,11 +58,13 @@
         </w:drawing>
       </w:r>
       <w:r>
-        <w:rPr/>
+        <w:rPr>
+          <w:noProof/>
+        </w:rPr>
         <mc:AlternateContent>
-          <mc:Choice Requires="wps">
+          <mc:Choice Requires="wpg">
             <w:drawing>
-              <wp:anchor distT="0" distB="0" distL="0" distR="0" allowOverlap="1" layoutInCell="1" locked="0" behindDoc="1" simplePos="0" relativeHeight="487485952">
+              <wp:anchor distT="0" distB="0" distL="0" distR="0" simplePos="0" relativeHeight="487485952" behindDoc="1" locked="0" layoutInCell="1" allowOverlap="1" wp14:anchorId="1477BE81" wp14:editId="50D414EF">
                 <wp:simplePos x="0" y="0"/>
                 <wp:positionH relativeFrom="page">
                   <wp:posOffset>369570</wp:posOffset>
@@ -73,17 +77,19 @@
                 <wp:wrapNone/>
                 <wp:docPr id="2" name="Group 2"/>
                 <wp:cNvGraphicFramePr>
-                  <a:graphicFrameLocks/>
+                  <a:graphicFrameLocks xmlns:a="http://schemas.openxmlformats.org/drawingml/2006/main"/>
                 </wp:cNvGraphicFramePr>
-                <a:graphic>
+                <a:graphic xmlns:a="http://schemas.openxmlformats.org/drawingml/2006/main">
                   <a:graphicData uri="http://schemas.microsoft.com/office/word/2010/wordprocessingGroup">
                     <wpg:wgp>
-                      <wpg:cNvPr id="2" name="Group 2"/>
-                      <wpg:cNvGrpSpPr/>
+                      <wpg:cNvGrpSpPr>
+                        <a:grpSpLocks/>
+                      </wpg:cNvGrpSpPr>
                       <wpg:grpSpPr>
                         <a:xfrm>
                           <a:off x="0" y="0"/>
                           <a:ext cx="6829425" cy="2314575"/>
+                          <a:chOff x="0" y="0"/>
                           <a:chExt cx="6829425" cy="2314575"/>
                         </a:xfrm>
                       </wpg:grpSpPr>
@@ -179,13 +185,13 @@
                           <a:noAutofit/>
                         </wps:bodyPr>
                       </wps:wsp>
-                      <pic:pic>
+                      <pic:pic xmlns:pic="http://schemas.openxmlformats.org/drawingml/2006/picture">
                         <pic:nvPicPr>
                           <pic:cNvPr id="5" name="Image 5"/>
                           <pic:cNvPicPr/>
                         </pic:nvPicPr>
                         <pic:blipFill>
-                          <a:blip r:embed="rId6" cstate="print"/>
+                          <a:blip r:embed="rId5" cstate="print"/>
                           <a:stretch>
                             <a:fillRect/>
                           </a:stretch>
@@ -200,13 +206,13 @@
                           </a:prstGeom>
                         </pic:spPr>
                       </pic:pic>
-                      <pic:pic>
+                      <pic:pic xmlns:pic="http://schemas.openxmlformats.org/drawingml/2006/picture">
                         <pic:nvPicPr>
                           <pic:cNvPr id="6" name="Image 6"/>
                           <pic:cNvPicPr/>
                         </pic:nvPicPr>
                         <pic:blipFill>
-                          <a:blip r:embed="rId7" cstate="print"/>
+                          <a:blip r:embed="rId6" cstate="print"/>
                           <a:stretch>
                             <a:fillRect/>
                           </a:stretch>
@@ -238,8 +244,7 @@
                             <w:p>
                               <w:pPr>
                                 <w:spacing w:before="106"/>
-                                <w:ind w:left="721" w:right="0" w:firstLine="0"/>
-                                <w:jc w:val="left"/>
+                                <w:ind w:left="721"/>
                                 <w:rPr>
                                   <w:rFonts w:ascii="Arial"/>
                                   <w:b/>
@@ -259,7 +264,7 @@
                                   <w:spacing w:val="-6"/>
                                   <w:sz w:val="24"/>
                                 </w:rPr>
-                                <w:t> </w:t>
+                                <w:t xml:space="preserve"> </w:t>
                               </w:r>
                               <w:r>
                                 <w:rPr>
@@ -278,7 +283,7 @@
                                   <w:spacing w:val="-9"/>
                                   <w:sz w:val="27"/>
                                 </w:rPr>
-                                <w:t> </w:t>
+                                <w:t xml:space="preserve"> </w:t>
                               </w:r>
                               <w:r>
                                 <w:rPr>
@@ -297,7 +302,7 @@
                                   <w:spacing w:val="-18"/>
                                   <w:sz w:val="27"/>
                                 </w:rPr>
-                                <w:t> </w:t>
+                                <w:t xml:space="preserve"> </w:t>
                               </w:r>
                               <w:r>
                                 <w:rPr>
@@ -316,7 +321,7 @@
                                   <w:spacing w:val="-6"/>
                                   <w:sz w:val="27"/>
                                 </w:rPr>
-                                <w:t> </w:t>
+                                <w:t xml:space="preserve"> </w:t>
                               </w:r>
                               <w:r>
                                 <w:rPr>
@@ -332,8 +337,7 @@
                             <w:p>
                               <w:pPr>
                                 <w:spacing w:before="106"/>
-                                <w:ind w:left="721" w:right="0" w:firstLine="0"/>
-                                <w:jc w:val="left"/>
+                                <w:ind w:left="721"/>
                                 <w:rPr>
                                   <w:sz w:val="18"/>
                                 </w:rPr>
@@ -351,7 +355,7 @@
                                   <w:spacing w:val="-3"/>
                                   <w:sz w:val="18"/>
                                 </w:rPr>
-                                <w:t> </w:t>
+                                <w:t xml:space="preserve"> </w:t>
                               </w:r>
                               <w:r>
                                 <w:rPr>
@@ -366,7 +370,7 @@
                                   <w:spacing w:val="-1"/>
                                   <w:sz w:val="18"/>
                                 </w:rPr>
-                                <w:t> </w:t>
+                                <w:t xml:space="preserve"> </w:t>
                               </w:r>
                               <w:r>
                                 <w:rPr>
@@ -381,7 +385,7 @@
                                   <w:spacing w:val="-4"/>
                                   <w:sz w:val="18"/>
                                 </w:rPr>
-                                <w:t> </w:t>
+                                <w:t xml:space="preserve"> </w:t>
                               </w:r>
                               <w:r>
                                 <w:rPr>
@@ -396,7 +400,7 @@
                                   <w:spacing w:val="-3"/>
                                   <w:sz w:val="18"/>
                                 </w:rPr>
-                                <w:t> </w:t>
+                                <w:t xml:space="preserve"> </w:t>
                               </w:r>
                               <w:r>
                                 <w:rPr>
@@ -411,7 +415,7 @@
                                   <w:spacing w:val="-5"/>
                                   <w:sz w:val="18"/>
                                 </w:rPr>
-                                <w:t> </w:t>
+                                <w:t xml:space="preserve"> </w:t>
                               </w:r>
                               <w:r>
                                 <w:rPr>
@@ -426,7 +430,7 @@
                                   <w:spacing w:val="-2"/>
                                   <w:sz w:val="18"/>
                                 </w:rPr>
-                                <w:t> departure</w:t>
+                                <w:t xml:space="preserve"> departure</w:t>
                               </w:r>
                             </w:p>
                           </w:txbxContent>
@@ -443,31 +447,49 @@
           </mc:Choice>
           <mc:Fallback>
             <w:pict>
-              <v:group style="position:absolute;margin-left:29.1pt;margin-top:395.089966pt;width:537.75pt;height:182.25pt;mso-position-horizontal-relative:page;mso-position-vertical-relative:page;z-index:-15830528" id="docshapegroup1" coordorigin="582,7902" coordsize="10755,3645">
-                <v:rect style="position:absolute;left:582;top:7901;width:10755;height:15" id="docshape2" filled="true" fillcolor="#333333" stroked="false">
-                  <v:fill type="solid"/>
-                </v:rect>
-                <v:rect style="position:absolute;left:582;top:8636;width:3315;height:2835" id="docshape3" filled="true" fillcolor="#e6e6e8" stroked="false">
-                  <v:fill type="solid"/>
-                </v:rect>
-                <v:shape style="position:absolute;left:612;top:7946;width:660;height:660" type="#_x0000_t75" id="docshape4" stroked="false">
-                  <v:imagedata r:id="rId6" o:title=""/>
+              <v:group w14:anchorId="1477BE81" id="Group 2" o:spid="_x0000_s1026" style="position:absolute;left:0;text-align:left;margin-left:29.1pt;margin-top:395.1pt;width:537.75pt;height:182.25pt;z-index:-15830528;mso-wrap-distance-left:0;mso-wrap-distance-right:0;mso-position-horizontal-relative:page;mso-position-vertical-relative:page" coordsize="68294,23145" o:gfxdata="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">
+                <v:shape id="Graphic 3" o:spid="_x0000_s1027" style="position:absolute;width:68294;height:95;visibility:visible;mso-wrap-style:square;v-text-anchor:top" coordsize="6829425,9525" o:gfxdata="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" path="m6829425,l,,,9525r6829425,l6829425,xe" fillcolor="#333" stroked="f">
+                  <v:path arrowok="t"/>
                 </v:shape>
-                <v:shape style="position:absolute;left:582;top:11141;width:240;height:405" type="#_x0000_t75" id="docshape5" stroked="false">
+                <v:shape id="Graphic 4" o:spid="_x0000_s1028" style="position:absolute;top:4667;width:21050;height:18002;visibility:visible;mso-wrap-style:square;v-text-anchor:top" coordsize="2105025,1800225" o:gfxdata="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" path="m2105025,l,,,1800225r2105025,l2105025,xe" fillcolor="#e6e6e8" stroked="f">
+                  <v:path arrowok="t"/>
+                </v:shape>
+                <v:shapetype id="_x0000_t75" coordsize="21600,21600" o:spt="75" o:preferrelative="t" path="m@4@5l@4@11@9@11@9@5xe" filled="f" stroked="f">
+                  <v:stroke joinstyle="miter"/>
+                  <v:formulas>
+                    <v:f eqn="if lineDrawn pixelLineWidth 0"/>
+                    <v:f eqn="sum @0 1 0"/>
+                    <v:f eqn="sum 0 0 @1"/>
+                    <v:f eqn="prod @2 1 2"/>
+                    <v:f eqn="prod @3 21600 pixelWidth"/>
+                    <v:f eqn="prod @3 21600 pixelHeight"/>
+                    <v:f eqn="sum @0 0 1"/>
+                    <v:f eqn="prod @6 1 2"/>
+                    <v:f eqn="prod @7 21600 pixelWidth"/>
+                    <v:f eqn="sum @8 21600 0"/>
+                    <v:f eqn="prod @7 21600 pixelHeight"/>
+                    <v:f eqn="sum @10 21600 0"/>
+                  </v:formulas>
+                  <v:path o:extrusionok="f" gradientshapeok="t" o:connecttype="rect"/>
+                  <o:lock v:ext="edit" aspectratio="t"/>
+                </v:shapetype>
+                <v:shape id="Image 5" o:spid="_x0000_s1029" type="#_x0000_t75" style="position:absolute;left:190;top:285;width:4191;height:4191;visibility:visible;mso-wrap-style:square" o:gfxdata="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">
                   <v:imagedata r:id="rId7" o:title=""/>
                 </v:shape>
-                <v:shapetype id="_x0000_t202" o:spt="202" coordsize="21600,21600" path="m,l,21600r21600,l21600,xe">
+                <v:shape id="Image 6" o:spid="_x0000_s1030" type="#_x0000_t75" style="position:absolute;top:20574;width:1524;height:2571;visibility:visible;mso-wrap-style:square" o:gfxdata="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">
+                  <v:imagedata r:id="rId8" o:title=""/>
+                </v:shape>
+                <v:shapetype id="_x0000_t202" coordsize="21600,21600" o:spt="202" path="m,l,21600r21600,l21600,xe">
                   <v:stroke joinstyle="miter"/>
                   <v:path gradientshapeok="t" o:connecttype="rect"/>
                 </v:shapetype>
-                <v:shape style="position:absolute;left:582;top:7901;width:10755;height:3645" type="#_x0000_t202" id="docshape6" filled="false" stroked="false">
+                <v:shape id="Textbox 7" o:spid="_x0000_s1031" type="#_x0000_t202" style="position:absolute;width:68294;height:23145;visibility:visible;mso-wrap-style:square;v-text-anchor:top" o:gfxdata="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" filled="f" stroked="f">
                   <v:textbox inset="0,0,0,0">
                     <w:txbxContent>
                       <w:p>
                         <w:pPr>
                           <w:spacing w:before="106"/>
-                          <w:ind w:left="721" w:right="0" w:firstLine="0"/>
-                          <w:jc w:val="left"/>
+                          <w:ind w:left="721"/>
                           <w:rPr>
                             <w:rFonts w:ascii="Arial"/>
                             <w:b/>
@@ -487,7 +509,7 @@
                             <w:spacing w:val="-6"/>
                             <w:sz w:val="24"/>
                           </w:rPr>
-                          <w:t> </w:t>
+                          <w:t xml:space="preserve"> </w:t>
                         </w:r>
                         <w:r>
                           <w:rPr>
@@ -506,7 +528,7 @@
                             <w:spacing w:val="-9"/>
                             <w:sz w:val="27"/>
                           </w:rPr>
-                          <w:t> </w:t>
+                          <w:t xml:space="preserve"> </w:t>
                         </w:r>
                         <w:r>
                           <w:rPr>
@@ -525,7 +547,7 @@
                             <w:spacing w:val="-18"/>
                             <w:sz w:val="27"/>
                           </w:rPr>
-                          <w:t> </w:t>
+                          <w:t xml:space="preserve"> </w:t>
                         </w:r>
                         <w:r>
                           <w:rPr>
@@ -544,7 +566,7 @@
                             <w:spacing w:val="-6"/>
                             <w:sz w:val="27"/>
                           </w:rPr>
-                          <w:t> </w:t>
+                          <w:t xml:space="preserve"> </w:t>
                         </w:r>
                         <w:r>
                           <w:rPr>
@@ -560,8 +582,7 @@
                       <w:p>
                         <w:pPr>
                           <w:spacing w:before="106"/>
-                          <w:ind w:left="721" w:right="0" w:firstLine="0"/>
-                          <w:jc w:val="left"/>
+                          <w:ind w:left="721"/>
                           <w:rPr>
                             <w:sz w:val="18"/>
                           </w:rPr>
@@ -579,7 +600,7 @@
                             <w:spacing w:val="-3"/>
                             <w:sz w:val="18"/>
                           </w:rPr>
-                          <w:t> </w:t>
+                          <w:t xml:space="preserve"> </w:t>
                         </w:r>
                         <w:r>
                           <w:rPr>
@@ -594,7 +615,7 @@
                             <w:spacing w:val="-1"/>
                             <w:sz w:val="18"/>
                           </w:rPr>
-                          <w:t> </w:t>
+                          <w:t xml:space="preserve"> </w:t>
                         </w:r>
                         <w:r>
                           <w:rPr>
@@ -609,7 +630,7 @@
                             <w:spacing w:val="-4"/>
                             <w:sz w:val="18"/>
                           </w:rPr>
-                          <w:t> </w:t>
+                          <w:t xml:space="preserve"> </w:t>
                         </w:r>
                         <w:r>
                           <w:rPr>
@@ -624,7 +645,7 @@
                             <w:spacing w:val="-3"/>
                             <w:sz w:val="18"/>
                           </w:rPr>
-                          <w:t> </w:t>
+                          <w:t xml:space="preserve"> </w:t>
                         </w:r>
                         <w:r>
                           <w:rPr>
@@ -639,7 +660,7 @@
                             <w:spacing w:val="-5"/>
                             <w:sz w:val="18"/>
                           </w:rPr>
-                          <w:t> </w:t>
+                          <w:t xml:space="preserve"> </w:t>
                         </w:r>
                         <w:r>
                           <w:rPr>
@@ -654,41 +675,37 @@
                             <w:spacing w:val="-2"/>
                             <w:sz w:val="18"/>
                           </w:rPr>
-                          <w:t> departure</w:t>
+                          <w:t xml:space="preserve"> departure</w:t>
                         </w:r>
                       </w:p>
                     </w:txbxContent>
                   </v:textbox>
-                  <w10:wrap type="none"/>
                 </v:shape>
-                <w10:wrap type="none"/>
+                <w10:wrap anchorx="page" anchory="page"/>
               </v:group>
             </w:pict>
           </mc:Fallback>
         </mc:AlternateContent>
       </w:r>
       <w:r>
-        <w:rPr/>
         <w:t>05</w:t>
       </w:r>
       <w:r>
         <w:rPr>
           <w:spacing w:val="-7"/>
         </w:rPr>
-        <w:t> </w:t>
+        <w:t xml:space="preserve"> </w:t>
       </w:r>
       <w:r>
-        <w:rPr/>
         <w:t>JUN</w:t>
       </w:r>
       <w:r>
         <w:rPr>
           <w:spacing w:val="-4"/>
         </w:rPr>
-        <w:t> 2026</w:t>
+        <w:t xml:space="preserve"> 2026</w:t>
       </w:r>
       <w:r>
-        <w:rPr/>
         <w:tab/>
         <w:t>25</w:t>
       </w:r>
@@ -696,57 +713,52 @@
         <w:rPr>
           <w:spacing w:val="-6"/>
         </w:rPr>
-        <w:t> </w:t>
+        <w:t xml:space="preserve"> </w:t>
       </w:r>
       <w:r>
-        <w:rPr/>
         <w:t>JUN</w:t>
       </w:r>
       <w:r>
         <w:rPr>
           <w:spacing w:val="-3"/>
         </w:rPr>
-        <w:t> </w:t>
+        <w:t xml:space="preserve"> </w:t>
       </w:r>
       <w:r>
-        <w:rPr/>
         <w:t>2026</w:t>
       </w:r>
       <w:r>
         <w:rPr>
           <w:spacing w:val="-6"/>
         </w:rPr>
-        <w:t> </w:t>
+        <w:t xml:space="preserve"> </w:t>
       </w:r>
       <w:r>
-        <w:rPr/>
         <w:t>TRIP</w:t>
       </w:r>
       <w:r>
         <w:rPr>
           <w:spacing w:val="-4"/>
         </w:rPr>
-        <w:t> </w:t>
+        <w:t xml:space="preserve"> </w:t>
       </w:r>
       <w:r>
-        <w:rPr/>
         <w:t>TO</w:t>
       </w:r>
       <w:r>
         <w:rPr>
           <w:spacing w:val="-4"/>
         </w:rPr>
-        <w:t> </w:t>
+        <w:t xml:space="preserve"> </w:t>
       </w:r>
       <w:r>
-        <w:rPr/>
         <w:t>BEIJING,</w:t>
       </w:r>
       <w:r>
         <w:rPr>
           <w:spacing w:val="-12"/>
         </w:rPr>
-        <w:t> </w:t>
+        <w:t xml:space="preserve"> </w:t>
       </w:r>
       <w:r>
         <w:rPr>
@@ -768,27 +780,30 @@
       <w:r>
         <w:rPr>
           <w:rFonts w:ascii="Arial"/>
+          <w:noProof/>
           <w:sz w:val="2"/>
         </w:rPr>
         <mc:AlternateContent>
-          <mc:Choice Requires="wps">
+          <mc:Choice Requires="wpg">
             <w:drawing>
-              <wp:inline distT="0" distB="0" distL="0" distR="0">
+              <wp:inline distT="0" distB="0" distL="0" distR="0" wp14:anchorId="7333E5E5" wp14:editId="29077090">
                 <wp:extent cx="6829425" cy="9525"/>
                 <wp:effectExtent l="0" t="0" r="0" b="0"/>
                 <wp:docPr id="8" name="Group 8"/>
                 <wp:cNvGraphicFramePr>
-                  <a:graphicFrameLocks/>
+                  <a:graphicFrameLocks xmlns:a="http://schemas.openxmlformats.org/drawingml/2006/main"/>
                 </wp:cNvGraphicFramePr>
-                <a:graphic>
+                <a:graphic xmlns:a="http://schemas.openxmlformats.org/drawingml/2006/main">
                   <a:graphicData uri="http://schemas.microsoft.com/office/word/2010/wordprocessingGroup">
                     <wpg:wgp>
-                      <wpg:cNvPr id="8" name="Group 8"/>
-                      <wpg:cNvGrpSpPr/>
+                      <wpg:cNvGrpSpPr>
+                        <a:grpSpLocks/>
+                      </wpg:cNvGrpSpPr>
                       <wpg:grpSpPr>
                         <a:xfrm>
                           <a:off x="0" y="0"/>
                           <a:ext cx="6829425" cy="9525"/>
+                          <a:chOff x="0" y="0"/>
                           <a:chExt cx="6829425" cy="9525"/>
                         </a:xfrm>
                       </wpg:grpSpPr>
@@ -846,20 +861,15 @@
           </mc:Choice>
           <mc:Fallback>
             <w:pict>
-              <v:group style="width:537.75pt;height:.75pt;mso-position-horizontal-relative:char;mso-position-vertical-relative:line" id="docshapegroup7" coordorigin="0,0" coordsize="10755,15">
-                <v:rect style="position:absolute;left:0;top:0;width:10755;height:15" id="docshape8" filled="true" fillcolor="#333333" stroked="false">
-                  <v:fill type="solid"/>
-                </v:rect>
+              <v:group w14:anchorId="61C2AAD7" id="Group 8" o:spid="_x0000_s1026" style="width:537.75pt;height:.75pt;mso-position-horizontal-relative:char;mso-position-vertical-relative:line" coordsize="68294,95" o:gfxdata="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">
+                <v:shape id="Graphic 9" o:spid="_x0000_s1027" style="position:absolute;width:68294;height:95;visibility:visible;mso-wrap-style:square;v-text-anchor:top" coordsize="6829425,9525" o:gfxdata="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" path="m6829425,l,,,9525r6829425,l6829425,xe" fillcolor="#333" stroked="f">
+                  <v:path arrowok="t"/>
+                </v:shape>
+                <w10:anchorlock/>
               </v:group>
             </w:pict>
           </mc:Fallback>
         </mc:AlternateContent>
-      </w:r>
-      <w:r>
-        <w:rPr>
-          <w:rFonts w:ascii="Arial"/>
-          <w:sz w:val="2"/>
-        </w:rPr>
       </w:r>
     </w:p>
     <w:p>
@@ -869,9 +879,11 @@
         <w:ind w:left="146"/>
       </w:pPr>
       <w:r>
-        <w:rPr/>
+        <w:rPr>
+          <w:noProof/>
+        </w:rPr>
         <w:drawing>
-          <wp:anchor distT="0" distB="0" distL="0" distR="0" allowOverlap="1" layoutInCell="1" locked="0" behindDoc="0" simplePos="0" relativeHeight="15731200">
+          <wp:anchor distT="0" distB="0" distL="0" distR="0" simplePos="0" relativeHeight="15731200" behindDoc="0" locked="0" layoutInCell="1" allowOverlap="1" wp14:anchorId="1D760D38" wp14:editId="54E5ED11">
             <wp:simplePos x="0" y="0"/>
             <wp:positionH relativeFrom="page">
               <wp:posOffset>3429585</wp:posOffset>
@@ -884,17 +896,17 @@
             <wp:wrapNone/>
             <wp:docPr id="10" name="Image 10" descr="Free Download Logo Vietnam Airlines Vector AI PDF EPS PNG"/>
             <wp:cNvGraphicFramePr>
-              <a:graphicFrameLocks/>
+              <a:graphicFrameLocks xmlns:a="http://schemas.openxmlformats.org/drawingml/2006/main"/>
             </wp:cNvGraphicFramePr>
-            <a:graphic>
+            <a:graphic xmlns:a="http://schemas.openxmlformats.org/drawingml/2006/main">
               <a:graphicData uri="http://schemas.openxmlformats.org/drawingml/2006/picture">
-                <pic:pic>
+                <pic:pic xmlns:pic="http://schemas.openxmlformats.org/drawingml/2006/picture">
                   <pic:nvPicPr>
                     <pic:cNvPr id="10" name="Image 10" descr="Free Download Logo Vietnam Airlines Vector AI PDF EPS PNG"/>
                     <pic:cNvPicPr/>
                   </pic:nvPicPr>
                   <pic:blipFill>
-                    <a:blip r:embed="rId8" cstate="print"/>
+                    <a:blip r:embed="rId9" cstate="print"/>
                     <a:stretch>
                       <a:fillRect/>
                     </a:stretch>
@@ -925,7 +937,7 @@
           <w:color w:val="333333"/>
           <w:spacing w:val="-10"/>
         </w:rPr>
-        <w:t> </w:t>
+        <w:t xml:space="preserve"> </w:t>
       </w:r>
       <w:r>
         <w:rPr>
@@ -937,21 +949,21 @@
     </w:p>
     <w:p>
       <w:pPr>
-        <w:spacing w:line="237" w:lineRule="auto" w:before="4"/>
-        <w:ind w:left="35" w:right="7439" w:firstLine="0"/>
-        <w:jc w:val="left"/>
+        <w:spacing w:before="4" w:line="237" w:lineRule="auto"/>
+        <w:ind w:left="35" w:right="7439"/>
         <w:rPr>
           <w:sz w:val="18"/>
         </w:rPr>
       </w:pPr>
       <w:r>
         <w:rPr>
+          <w:noProof/>
           <w:sz w:val="18"/>
         </w:rPr>
         <mc:AlternateContent>
-          <mc:Choice Requires="wps">
+          <mc:Choice Requires="wpg">
             <w:drawing>
-              <wp:anchor distT="0" distB="0" distL="0" distR="0" allowOverlap="1" layoutInCell="1" locked="0" behindDoc="1" simplePos="0" relativeHeight="487588352">
+              <wp:anchor distT="0" distB="0" distL="0" distR="0" simplePos="0" relativeHeight="487588352" behindDoc="1" locked="0" layoutInCell="1" allowOverlap="1" wp14:anchorId="13C48935" wp14:editId="75D07C89">
                 <wp:simplePos x="0" y="0"/>
                 <wp:positionH relativeFrom="page">
                   <wp:posOffset>365759</wp:posOffset>
@@ -964,27 +976,29 @@
                 <wp:wrapTopAndBottom/>
                 <wp:docPr id="11" name="Group 11"/>
                 <wp:cNvGraphicFramePr>
-                  <a:graphicFrameLocks/>
+                  <a:graphicFrameLocks xmlns:a="http://schemas.openxmlformats.org/drawingml/2006/main"/>
                 </wp:cNvGraphicFramePr>
-                <a:graphic>
+                <a:graphic xmlns:a="http://schemas.openxmlformats.org/drawingml/2006/main">
                   <a:graphicData uri="http://schemas.microsoft.com/office/word/2010/wordprocessingGroup">
                     <wpg:wgp>
-                      <wpg:cNvPr id="11" name="Group 11"/>
-                      <wpg:cNvGrpSpPr/>
+                      <wpg:cNvGrpSpPr>
+                        <a:grpSpLocks/>
+                      </wpg:cNvGrpSpPr>
                       <wpg:grpSpPr>
                         <a:xfrm>
                           <a:off x="0" y="0"/>
                           <a:ext cx="6899275" cy="3360420"/>
+                          <a:chOff x="0" y="0"/>
                           <a:chExt cx="6899275" cy="3360420"/>
                         </a:xfrm>
                       </wpg:grpSpPr>
-                      <pic:pic>
+                      <pic:pic xmlns:pic="http://schemas.openxmlformats.org/drawingml/2006/picture">
                         <pic:nvPicPr>
                           <pic:cNvPr id="12" name="Image 12"/>
                           <pic:cNvPicPr/>
                         </pic:nvPicPr>
                         <pic:blipFill>
-                          <a:blip r:embed="rId5" cstate="print"/>
+                          <a:blip r:embed="rId4" cstate="print"/>
                           <a:stretch>
                             <a:fillRect/>
                           </a:stretch>
@@ -1091,13 +1105,13 @@
                           <a:noAutofit/>
                         </wps:bodyPr>
                       </wps:wsp>
-                      <pic:pic>
+                      <pic:pic xmlns:pic="http://schemas.openxmlformats.org/drawingml/2006/picture">
                         <pic:nvPicPr>
                           <pic:cNvPr id="15" name="Image 15"/>
                           <pic:cNvPicPr/>
                         </pic:nvPicPr>
                         <pic:blipFill>
-                          <a:blip r:embed="rId6" cstate="print"/>
+                          <a:blip r:embed="rId5" cstate="print"/>
                           <a:stretch>
                             <a:fillRect/>
                           </a:stretch>
@@ -1112,13 +1126,13 @@
                           </a:prstGeom>
                         </pic:spPr>
                       </pic:pic>
-                      <pic:pic>
+                      <pic:pic xmlns:pic="http://schemas.openxmlformats.org/drawingml/2006/picture">
                         <pic:nvPicPr>
                           <pic:cNvPr id="16" name="Image 16"/>
                           <pic:cNvPicPr/>
                         </pic:nvPicPr>
                         <pic:blipFill>
-                          <a:blip r:embed="rId7" cstate="print"/>
+                          <a:blip r:embed="rId6" cstate="print"/>
                           <a:stretch>
                             <a:fillRect/>
                           </a:stretch>
@@ -1212,7 +1226,7 @@
                             <a:cxnLst/>
                             <a:rect l="l" t="t" r="r" b="b"/>
                             <a:pathLst>
-                              <a:path w="0" h="821690">
+                              <a:path h="821690">
                                 <a:moveTo>
                                   <a:pt x="0" y="0"/>
                                 </a:moveTo>
@@ -1220,7 +1234,7 @@
                                   <a:pt x="0" y="172212"/>
                                 </a:lnTo>
                               </a:path>
-                              <a:path w="0" h="821690">
+                              <a:path h="821690">
                                 <a:moveTo>
                                   <a:pt x="0" y="172212"/>
                                 </a:moveTo>
@@ -1228,7 +1242,7 @@
                                   <a:pt x="0" y="493775"/>
                                 </a:lnTo>
                               </a:path>
-                              <a:path w="0" h="821690">
+                              <a:path h="821690">
                                 <a:moveTo>
                                   <a:pt x="0" y="493775"/>
                                 </a:moveTo>
@@ -1236,7 +1250,7 @@
                                   <a:pt x="0" y="673608"/>
                                 </a:lnTo>
                               </a:path>
-                              <a:path w="0" h="821690">
+                              <a:path h="821690">
                                 <a:moveTo>
                                   <a:pt x="0" y="673608"/>
                                 </a:moveTo>
@@ -1375,7 +1389,7 @@
                             <a:cxnLst/>
                             <a:rect l="l" t="t" r="r" b="b"/>
                             <a:pathLst>
-                              <a:path w="0" h="475615">
+                              <a:path h="475615">
                                 <a:moveTo>
                                   <a:pt x="0" y="0"/>
                                 </a:moveTo>
@@ -1629,7 +1643,7 @@
                             <a:cxnLst/>
                             <a:rect l="l" t="t" r="r" b="b"/>
                             <a:pathLst>
-                              <a:path w="0" h="1306830">
+                              <a:path h="1306830">
                                 <a:moveTo>
                                   <a:pt x="0" y="0"/>
                                 </a:moveTo>
@@ -1720,7 +1734,7 @@
                             <a:cxnLst/>
                             <a:rect l="l" t="t" r="r" b="b"/>
                             <a:pathLst>
-                              <a:path w="0" h="1306830">
+                              <a:path h="1306830">
                                 <a:moveTo>
                                   <a:pt x="0" y="0"/>
                                 </a:moveTo>
@@ -1848,9 +1862,7 @@
                           <w:txbxContent>
                             <w:p>
                               <w:pPr>
-                                <w:spacing w:line="303" w:lineRule="exact" w:before="0"/>
-                                <w:ind w:left="0" w:right="0" w:firstLine="0"/>
-                                <w:jc w:val="left"/>
+                                <w:spacing w:line="303" w:lineRule="exact"/>
                                 <w:rPr>
                                   <w:rFonts w:ascii="Arial"/>
                                   <w:b/>
@@ -1870,7 +1882,7 @@
                                   <w:spacing w:val="-3"/>
                                   <w:sz w:val="24"/>
                                 </w:rPr>
-                                <w:t> </w:t>
+                                <w:t xml:space="preserve"> </w:t>
                               </w:r>
                               <w:r>
                                 <w:rPr>
@@ -1889,7 +1901,7 @@
                                   <w:spacing w:val="-5"/>
                                   <w:sz w:val="27"/>
                                 </w:rPr>
-                                <w:t> </w:t>
+                                <w:t xml:space="preserve"> </w:t>
                               </w:r>
                               <w:r>
                                 <w:rPr>
@@ -1908,7 +1920,7 @@
                                   <w:spacing w:val="-4"/>
                                   <w:sz w:val="27"/>
                                 </w:rPr>
-                                <w:t> </w:t>
+                                <w:t xml:space="preserve"> </w:t>
                               </w:r>
                               <w:r>
                                 <w:rPr>
@@ -1927,7 +1939,7 @@
                                   <w:spacing w:val="-3"/>
                                   <w:sz w:val="27"/>
                                 </w:rPr>
-                                <w:t> </w:t>
+                                <w:t xml:space="preserve"> </w:t>
                               </w:r>
                               <w:r>
                                 <w:rPr>
@@ -1943,8 +1955,6 @@
                             <w:p>
                               <w:pPr>
                                 <w:spacing w:before="105"/>
-                                <w:ind w:left="0" w:right="0" w:firstLine="0"/>
-                                <w:jc w:val="left"/>
                                 <w:rPr>
                                   <w:sz w:val="18"/>
                                 </w:rPr>
@@ -1962,7 +1972,7 @@
                                   <w:spacing w:val="-3"/>
                                   <w:sz w:val="18"/>
                                 </w:rPr>
-                                <w:t> </w:t>
+                                <w:t xml:space="preserve"> </w:t>
                               </w:r>
                               <w:r>
                                 <w:rPr>
@@ -1977,7 +1987,7 @@
                                   <w:spacing w:val="-1"/>
                                   <w:sz w:val="18"/>
                                 </w:rPr>
-                                <w:t> </w:t>
+                                <w:t xml:space="preserve"> </w:t>
                               </w:r>
                               <w:r>
                                 <w:rPr>
@@ -1992,7 +2002,7 @@
                                   <w:spacing w:val="-3"/>
                                   <w:sz w:val="18"/>
                                 </w:rPr>
-                                <w:t> </w:t>
+                                <w:t xml:space="preserve"> </w:t>
                               </w:r>
                               <w:r>
                                 <w:rPr>
@@ -2007,7 +2017,7 @@
                                   <w:spacing w:val="-3"/>
                                   <w:sz w:val="18"/>
                                 </w:rPr>
-                                <w:t> </w:t>
+                                <w:t xml:space="preserve"> </w:t>
                               </w:r>
                               <w:r>
                                 <w:rPr>
@@ -2022,7 +2032,7 @@
                                   <w:spacing w:val="-5"/>
                                   <w:sz w:val="18"/>
                                 </w:rPr>
-                                <w:t> </w:t>
+                                <w:t xml:space="preserve"> </w:t>
                               </w:r>
                               <w:r>
                                 <w:rPr>
@@ -2037,7 +2047,7 @@
                                   <w:spacing w:val="-2"/>
                                   <w:sz w:val="18"/>
                                 </w:rPr>
-                                <w:t> departure</w:t>
+                                <w:t xml:space="preserve"> departure</w:t>
                               </w:r>
                             </w:p>
                           </w:txbxContent>
@@ -2062,9 +2072,7 @@
                           <w:txbxContent>
                             <w:p>
                               <w:pPr>
-                                <w:spacing w:line="303" w:lineRule="exact" w:before="0"/>
-                                <w:ind w:left="0" w:right="0" w:firstLine="0"/>
-                                <w:jc w:val="left"/>
+                                <w:spacing w:line="303" w:lineRule="exact"/>
                                 <w:rPr>
                                   <w:sz w:val="27"/>
                                 </w:rPr>
@@ -2081,8 +2089,6 @@
                             <w:p>
                               <w:pPr>
                                 <w:spacing w:before="2"/>
-                                <w:ind w:left="0" w:right="0" w:firstLine="0"/>
-                                <w:jc w:val="left"/>
                                 <w:rPr>
                                   <w:sz w:val="18"/>
                                 </w:rPr>
@@ -2101,7 +2107,7 @@
                                   <w:spacing w:val="-6"/>
                                   <w:sz w:val="18"/>
                                 </w:rPr>
-                                <w:t> </w:t>
+                                <w:t xml:space="preserve"> </w:t>
                               </w:r>
                               <w:r>
                                 <w:rPr>
@@ -2134,9 +2140,7 @@
                           <w:txbxContent>
                             <w:p>
                               <w:pPr>
-                                <w:spacing w:line="303" w:lineRule="exact" w:before="0"/>
-                                <w:ind w:left="0" w:right="0" w:firstLine="0"/>
-                                <w:jc w:val="left"/>
+                                <w:spacing w:line="303" w:lineRule="exact"/>
                                 <w:rPr>
                                   <w:sz w:val="27"/>
                                 </w:rPr>
@@ -2153,8 +2157,6 @@
                             <w:p>
                               <w:pPr>
                                 <w:spacing w:before="2"/>
-                                <w:ind w:left="0" w:right="0" w:firstLine="0"/>
-                                <w:jc w:val="left"/>
                                 <w:rPr>
                                   <w:sz w:val="18"/>
                                 </w:rPr>
@@ -2172,7 +2174,7 @@
                                   <w:spacing w:val="-4"/>
                                   <w:sz w:val="18"/>
                                 </w:rPr>
-                                <w:t> CHINA</w:t>
+                                <w:t xml:space="preserve"> CHINA</w:t>
                               </w:r>
                             </w:p>
                           </w:txbxContent>
@@ -2197,9 +2199,7 @@
                           <w:txbxContent>
                             <w:p>
                               <w:pPr>
-                                <w:spacing w:line="201" w:lineRule="exact" w:before="0"/>
-                                <w:ind w:left="0" w:right="0" w:firstLine="0"/>
-                                <w:jc w:val="left"/>
+                                <w:spacing w:line="201" w:lineRule="exact"/>
                                 <w:rPr>
                                   <w:sz w:val="18"/>
                                 </w:rPr>
@@ -2216,8 +2216,7 @@
                             <w:p>
                               <w:pPr>
                                 <w:spacing w:before="2"/>
-                                <w:ind w:left="0" w:right="12" w:firstLine="0"/>
-                                <w:jc w:val="left"/>
+                                <w:ind w:right="12"/>
                                 <w:rPr>
                                   <w:sz w:val="18"/>
                                 </w:rPr>
@@ -2235,7 +2234,7 @@
                                   <w:spacing w:val="-13"/>
                                   <w:sz w:val="18"/>
                                 </w:rPr>
-                                <w:t> </w:t>
+                                <w:t xml:space="preserve"> </w:t>
                               </w:r>
                               <w:r>
                                 <w:rPr>
@@ -2267,9 +2266,7 @@
                           <w:txbxContent>
                             <w:p>
                               <w:pPr>
-                                <w:spacing w:line="201" w:lineRule="exact" w:before="0"/>
-                                <w:ind w:left="0" w:right="0" w:firstLine="0"/>
-                                <w:jc w:val="left"/>
+                                <w:spacing w:line="201" w:lineRule="exact"/>
                                 <w:rPr>
                                   <w:sz w:val="18"/>
                                 </w:rPr>
@@ -2287,14 +2284,12 @@
                                   <w:spacing w:val="-5"/>
                                   <w:sz w:val="18"/>
                                 </w:rPr>
-                                <w:t> At:</w:t>
+                                <w:t xml:space="preserve"> At:</w:t>
                               </w:r>
                             </w:p>
                             <w:p>
                               <w:pPr>
                                 <w:spacing w:before="6"/>
-                                <w:ind w:left="0" w:right="0" w:firstLine="0"/>
-                                <w:jc w:val="left"/>
                                 <w:rPr>
                                   <w:sz w:val="27"/>
                                 </w:rPr>
@@ -2310,9 +2305,8 @@
                             </w:p>
                             <w:p>
                               <w:pPr>
-                                <w:spacing w:line="242" w:lineRule="auto" w:before="147"/>
-                                <w:ind w:left="0" w:right="14" w:firstLine="0"/>
-                                <w:jc w:val="left"/>
+                                <w:spacing w:before="147" w:line="242" w:lineRule="auto"/>
+                                <w:ind w:right="14"/>
                                 <w:rPr>
                                   <w:sz w:val="18"/>
                                 </w:rPr>
@@ -2323,7 +2317,7 @@
                                   <w:spacing w:val="-2"/>
                                   <w:sz w:val="18"/>
                                 </w:rPr>
-                                <w:t>Terminal: </w:t>
+                                <w:t xml:space="preserve">Terminal: </w:t>
                               </w:r>
                               <w:r>
                                 <w:rPr>
@@ -2338,7 +2332,7 @@
                                   <w:spacing w:val="-13"/>
                                   <w:sz w:val="18"/>
                                 </w:rPr>
-                                <w:t> </w:t>
+                                <w:t xml:space="preserve"> </w:t>
                               </w:r>
                               <w:r>
                                 <w:rPr>
@@ -2370,9 +2364,7 @@
                           <w:txbxContent>
                             <w:p>
                               <w:pPr>
-                                <w:spacing w:line="201" w:lineRule="exact" w:before="0"/>
-                                <w:ind w:left="0" w:right="0" w:firstLine="0"/>
-                                <w:jc w:val="left"/>
+                                <w:spacing w:line="201" w:lineRule="exact"/>
                                 <w:rPr>
                                   <w:sz w:val="18"/>
                                 </w:rPr>
@@ -2390,7 +2382,7 @@
                                   <w:spacing w:val="-4"/>
                                   <w:sz w:val="18"/>
                                 </w:rPr>
-                                <w:t> </w:t>
+                                <w:t xml:space="preserve"> </w:t>
                               </w:r>
                               <w:r>
                                 <w:rPr>
@@ -2404,8 +2396,6 @@
                             <w:p>
                               <w:pPr>
                                 <w:spacing w:before="6"/>
-                                <w:ind w:left="0" w:right="0" w:firstLine="0"/>
-                                <w:jc w:val="left"/>
                                 <w:rPr>
                                   <w:sz w:val="27"/>
                                 </w:rPr>
@@ -2421,9 +2411,8 @@
                             </w:p>
                             <w:p>
                               <w:pPr>
-                                <w:spacing w:line="242" w:lineRule="auto" w:before="147"/>
-                                <w:ind w:left="0" w:right="14" w:firstLine="0"/>
-                                <w:jc w:val="left"/>
+                                <w:spacing w:before="147" w:line="242" w:lineRule="auto"/>
+                                <w:ind w:right="14"/>
                                 <w:rPr>
                                   <w:sz w:val="18"/>
                                 </w:rPr>
@@ -2434,7 +2423,7 @@
                                   <w:spacing w:val="-2"/>
                                   <w:sz w:val="18"/>
                                 </w:rPr>
-                                <w:t>Terminal: </w:t>
+                                <w:t xml:space="preserve">Terminal: </w:t>
                               </w:r>
                               <w:r>
                                 <w:rPr>
@@ -2449,7 +2438,7 @@
                                   <w:spacing w:val="-13"/>
                                   <w:sz w:val="18"/>
                                 </w:rPr>
-                                <w:t> </w:t>
+                                <w:t xml:space="preserve"> </w:t>
                               </w:r>
                               <w:r>
                                 <w:rPr>
@@ -2481,9 +2470,8 @@
                           <w:txbxContent>
                             <w:p>
                               <w:pPr>
-                                <w:spacing w:line="242" w:lineRule="auto" w:before="0"/>
-                                <w:ind w:left="0" w:right="18" w:firstLine="0"/>
-                                <w:jc w:val="left"/>
+                                <w:spacing w:line="242" w:lineRule="auto"/>
+                                <w:ind w:right="18"/>
                                 <w:rPr>
                                   <w:sz w:val="18"/>
                                 </w:rPr>
@@ -2501,14 +2489,14 @@
                                   <w:spacing w:val="-13"/>
                                   <w:sz w:val="18"/>
                                 </w:rPr>
-                                <w:t> </w:t>
-                              </w:r>
-                              <w:r>
-                                <w:rPr>
-                                  <w:color w:val="333333"/>
-                                  <w:sz w:val="18"/>
-                                </w:rPr>
-                                <w:t>(in </w:t>
+                                <w:t xml:space="preserve"> </w:t>
+                              </w:r>
+                              <w:r>
+                                <w:rPr>
+                                  <w:color w:val="333333"/>
+                                  <w:sz w:val="18"/>
+                                </w:rPr>
+                                <w:t xml:space="preserve">(in </w:t>
                               </w:r>
                               <w:r>
                                 <w:rPr>
@@ -2541,9 +2529,7 @@
                           <w:txbxContent>
                             <w:p>
                               <w:pPr>
-                                <w:spacing w:line="201" w:lineRule="exact" w:before="0"/>
-                                <w:ind w:left="0" w:right="0" w:firstLine="0"/>
-                                <w:jc w:val="left"/>
+                                <w:spacing w:line="201" w:lineRule="exact"/>
                                 <w:rPr>
                                   <w:sz w:val="18"/>
                                 </w:rPr>
@@ -2579,9 +2565,8 @@
                           <w:txbxContent>
                             <w:p>
                               <w:pPr>
-                                <w:spacing w:line="201" w:lineRule="exact" w:before="0"/>
-                                <w:ind w:left="31" w:right="0" w:firstLine="0"/>
-                                <w:jc w:val="left"/>
+                                <w:spacing w:line="201" w:lineRule="exact"/>
+                                <w:ind w:left="31"/>
                                 <w:rPr>
                                   <w:sz w:val="18"/>
                                 </w:rPr>
@@ -2599,7 +2584,7 @@
                                   <w:spacing w:val="-5"/>
                                   <w:sz w:val="18"/>
                                 </w:rPr>
-                                <w:t> </w:t>
+                                <w:t xml:space="preserve"> </w:t>
                               </w:r>
                               <w:r>
                                 <w:rPr>
@@ -2613,8 +2598,6 @@
                             <w:p>
                               <w:pPr>
                                 <w:spacing w:before="38"/>
-                                <w:ind w:left="0" w:right="0" w:firstLine="0"/>
-                                <w:jc w:val="left"/>
                                 <w:rPr>
                                   <w:sz w:val="20"/>
                                 </w:rPr>
@@ -2630,7 +2613,7 @@
                                   <w:spacing w:val="-6"/>
                                   <w:sz w:val="20"/>
                                 </w:rPr>
-                                <w:t> </w:t>
+                                <w:t xml:space="preserve"> </w:t>
                               </w:r>
                               <w:r>
                                 <w:rPr>
@@ -2643,7 +2626,7 @@
                                   <w:spacing w:val="-7"/>
                                   <w:sz w:val="20"/>
                                 </w:rPr>
-                                <w:t> </w:t>
+                                <w:t xml:space="preserve"> </w:t>
                               </w:r>
                               <w:r>
                                 <w:rPr>
@@ -2675,9 +2658,8 @@
                           <w:txbxContent>
                             <w:p>
                               <w:pPr>
-                                <w:spacing w:line="201" w:lineRule="exact" w:before="0"/>
-                                <w:ind w:left="28" w:right="0" w:firstLine="0"/>
-                                <w:jc w:val="left"/>
+                                <w:spacing w:line="201" w:lineRule="exact"/>
+                                <w:ind w:left="28"/>
                                 <w:rPr>
                                   <w:sz w:val="18"/>
                                 </w:rPr>
@@ -2694,29 +2676,19 @@
                             <w:p>
                               <w:pPr>
                                 <w:spacing w:before="38"/>
-                                <w:ind w:left="0" w:right="0" w:firstLine="0"/>
-                                <w:jc w:val="left"/>
-                                <w:rPr>
-                                  <w:sz w:val="22"/>
-                                </w:rPr>
                               </w:pPr>
                               <w:r>
-                                <w:rPr>
-                                  <w:sz w:val="22"/>
-                                </w:rPr>
                                 <w:t>Check-In</w:t>
                               </w:r>
                               <w:r>
                                 <w:rPr>
                                   <w:spacing w:val="-6"/>
-                                  <w:sz w:val="22"/>
-                                </w:rPr>
-                                <w:t> </w:t>
+                                </w:rPr>
+                                <w:t xml:space="preserve"> </w:t>
                               </w:r>
                               <w:r>
                                 <w:rPr>
                                   <w:spacing w:val="-2"/>
-                                  <w:sz w:val="22"/>
                                 </w:rPr>
                                 <w:t>Required</w:t>
                               </w:r>
@@ -2744,8 +2716,7 @@
                             <w:p>
                               <w:pPr>
                                 <w:spacing w:before="76"/>
-                                <w:ind w:left="151" w:right="0" w:firstLine="0"/>
-                                <w:jc w:val="left"/>
+                                <w:ind w:left="151"/>
                                 <w:rPr>
                                   <w:sz w:val="27"/>
                                 </w:rPr>
@@ -2763,7 +2734,7 @@
                                   <w:spacing w:val="-7"/>
                                   <w:sz w:val="27"/>
                                 </w:rPr>
-                                <w:t> </w:t>
+                                <w:t xml:space="preserve"> </w:t>
                               </w:r>
                               <w:r>
                                 <w:rPr>
@@ -2777,11 +2748,12 @@
                             <w:p>
                               <w:pPr>
                                 <w:spacing w:before="4"/>
-                                <w:ind w:left="151" w:right="0" w:firstLine="0"/>
-                                <w:jc w:val="left"/>
+                                <w:ind w:left="151"/>
                                 <w:rPr>
                                   <w:rFonts w:ascii="Arial"/>
                                   <w:b/>
+                                  <w:color w:val="333333"/>
+                                  <w:spacing w:val="-4"/>
                                   <w:sz w:val="27"/>
                                 </w:rPr>
                               </w:pPr>
@@ -2799,10 +2771,9 @@
                                   <w:rFonts w:ascii="Arial"/>
                                   <w:b/>
                                   <w:color w:val="333333"/>
-                                  <w:spacing w:val="-1"/>
                                   <w:sz w:val="27"/>
                                 </w:rPr>
-                                <w:t> </w:t>
+                                <w:t xml:space="preserve"> </w:t>
                               </w:r>
                               <w:r>
                                 <w:rPr>
@@ -2812,14 +2783,57 @@
                                   <w:spacing w:val="-4"/>
                                   <w:sz w:val="27"/>
                                 </w:rPr>
-                                <w:t>0512</w:t>
+                                <w:t>{{</w:t>
+                              </w:r>
+                              <w:r>
+                                <w:rPr>
+                                  <w:rFonts w:ascii="Consolas" w:eastAsia="Times New Roman" w:hAnsi="Consolas" w:cs="Times New Roman"/>
+                                  <w:color w:val="A5D6FF"/>
+                                  <w:sz w:val="21"/>
+                                  <w:szCs w:val="21"/>
+                                </w:rPr>
+                                <w:t xml:space="preserve"> </w:t>
+                              </w:r>
+                              <w:proofErr w:type="spellStart"/>
+                              <w:r>
+                                <w:rPr>
+                                  <w:rFonts w:ascii="Arial"/>
+                                  <w:b/>
+                                  <w:color w:val="333333"/>
+                                  <w:spacing w:val="-4"/>
+                                  <w:sz w:val="27"/>
+                                </w:rPr>
+                                <w:t>arrive_flight_number</w:t>
+                              </w:r>
+                              <w:proofErr w:type="spellEnd"/>
+                            </w:p>
+                            <w:p>
+                              <w:pPr>
+                                <w:spacing w:before="4"/>
+                                <w:ind w:left="151"/>
+                                <w:rPr>
+                                  <w:rFonts w:ascii="Arial"/>
+                                  <w:b/>
+                                  <w:color w:val="333333"/>
+                                  <w:spacing w:val="-4"/>
+                                  <w:sz w:val="27"/>
+                                </w:rPr>
+                              </w:pPr>
+                              <w:r>
+                                <w:rPr>
+                                  <w:rFonts w:ascii="Arial"/>
+                                  <w:b/>
+                                  <w:color w:val="333333"/>
+                                  <w:spacing w:val="-4"/>
+                                  <w:sz w:val="27"/>
+                                </w:rPr>
+                                <w:t>}}</w:t>
                               </w:r>
                             </w:p>
                             <w:p>
                               <w:pPr>
                                 <w:spacing w:before="149"/>
-                                <w:ind w:left="151" w:right="1949" w:firstLine="0"/>
-                                <w:jc w:val="left"/>
+                                <w:ind w:left="151" w:right="1949"/>
                                 <w:rPr>
                                   <w:sz w:val="18"/>
                                 </w:rPr>
@@ -2838,7 +2852,7 @@
                                   <w:spacing w:val="40"/>
                                   <w:sz w:val="18"/>
                                 </w:rPr>
-                                <w:t> </w:t>
+                                <w:t xml:space="preserve"> </w:t>
                               </w:r>
                               <w:r>
                                 <w:rPr>
@@ -2854,7 +2868,7 @@
                                   <w:spacing w:val="-11"/>
                                   <w:sz w:val="18"/>
                                 </w:rPr>
-                                <w:t> </w:t>
+                                <w:t xml:space="preserve"> </w:t>
                               </w:r>
                               <w:r>
                                 <w:rPr>
@@ -2868,8 +2882,7 @@
                             <w:p>
                               <w:pPr>
                                 <w:spacing w:before="155"/>
-                                <w:ind w:left="151" w:right="1949" w:firstLine="0"/>
-                                <w:jc w:val="left"/>
+                                <w:ind w:left="151" w:right="1949"/>
                                 <w:rPr>
                                   <w:sz w:val="18"/>
                                 </w:rPr>
@@ -2880,7 +2893,7 @@
                                   <w:spacing w:val="-2"/>
                                   <w:sz w:val="18"/>
                                 </w:rPr>
-                                <w:t>Cabin: </w:t>
+                                <w:t xml:space="preserve">Cabin: </w:t>
                               </w:r>
                               <w:r>
                                 <w:rPr>
@@ -2895,7 +2908,7 @@
                                   <w:spacing w:val="-15"/>
                                   <w:sz w:val="18"/>
                                 </w:rPr>
-                                <w:t> </w:t>
+                                <w:t xml:space="preserve"> </w:t>
                               </w:r>
                               <w:r>
                                 <w:rPr>
@@ -2910,7 +2923,7 @@
                                   <w:spacing w:val="-12"/>
                                   <w:sz w:val="18"/>
                                 </w:rPr>
-                                <w:t> </w:t>
+                                <w:t xml:space="preserve"> </w:t>
                               </w:r>
                               <w:r>
                                 <w:rPr>
@@ -2922,9 +2935,8 @@
                             </w:p>
                             <w:p>
                               <w:pPr>
-                                <w:spacing w:line="244" w:lineRule="auto" w:before="155"/>
-                                <w:ind w:left="151" w:right="1949" w:firstLine="0"/>
-                                <w:jc w:val="left"/>
+                                <w:spacing w:before="155" w:line="244" w:lineRule="auto"/>
+                                <w:ind w:left="151" w:right="1949"/>
                                 <w:rPr>
                                   <w:sz w:val="18"/>
                                 </w:rPr>
@@ -2952,71 +2964,66 @@
           </mc:Choice>
           <mc:Fallback>
             <w:pict>
-              <v:group style="position:absolute;margin-left:28.799999pt;margin-top:37.576027pt;width:543.25pt;height:264.6pt;mso-position-horizontal-relative:page;mso-position-vertical-relative:paragraph;z-index:-15728128;mso-wrap-distance-left:0;mso-wrap-distance-right:0" id="docshapegroup9" coordorigin="576,752" coordsize="10865,5292">
-                <v:shape style="position:absolute;left:6360;top:1741;width:120;height:180" type="#_x0000_t75" id="docshape10" stroked="false">
-                  <v:imagedata r:id="rId5" o:title=""/>
+              <v:group w14:anchorId="13C48935" id="Group 11" o:spid="_x0000_s1032" style="position:absolute;left:0;text-align:left;margin-left:28.8pt;margin-top:37.6pt;width:543.25pt;height:264.6pt;z-index:-15728128;mso-wrap-distance-left:0;mso-wrap-distance-right:0;mso-position-horizontal-relative:page" coordsize="68992,33604" o:gfxdata="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">
+                <v:shape id="Image 12" o:spid="_x0000_s1033" type="#_x0000_t75" style="position:absolute;left:36728;top:6286;width:762;height:1143;visibility:visible;mso-wrap-style:square" o:gfxdata="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">
+                  <v:imagedata r:id="rId10" o:title=""/>
                 </v:shape>
-                <v:rect style="position:absolute;left:578;top:751;width:10755;height:15" id="docshape11" filled="true" fillcolor="#333333" stroked="false">
-                  <v:fill type="solid"/>
-                </v:rect>
-                <v:rect style="position:absolute;left:578;top:1486;width:3315;height:2835" id="docshape12" filled="true" fillcolor="#e6e6e8" stroked="false">
-                  <v:fill type="solid"/>
-                </v:rect>
-                <v:shape style="position:absolute;left:608;top:796;width:660;height:660" type="#_x0000_t75" id="docshape13" stroked="false">
-                  <v:imagedata r:id="rId6" o:title=""/>
+                <v:shape id="Graphic 13" o:spid="_x0000_s1034" style="position:absolute;left:12;width:68294;height:95;visibility:visible;mso-wrap-style:square;v-text-anchor:top" coordsize="6829425,9525" o:gfxdata="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" path="m6829425,l,,,9525r6829425,l6829425,xe" fillcolor="#333" stroked="f">
+                  <v:path arrowok="t"/>
                 </v:shape>
-                <v:shape style="position:absolute;left:578;top:3991;width:240;height:405" type="#_x0000_t75" id="docshape14" stroked="false">
+                <v:shape id="Graphic 14" o:spid="_x0000_s1035" style="position:absolute;left:12;top:4667;width:21050;height:18002;visibility:visible;mso-wrap-style:square;v-text-anchor:top" coordsize="2105025,1800225" o:gfxdata="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" path="m2105025,l,,,1800225r2105025,l2105025,xe" fillcolor="#e6e6e8" stroked="f">
+                  <v:path arrowok="t"/>
+                </v:shape>
+                <v:shape id="Image 15" o:spid="_x0000_s1036" type="#_x0000_t75" style="position:absolute;left:203;top:285;width:4191;height:4191;visibility:visible;mso-wrap-style:square" o:gfxdata="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">
                   <v:imagedata r:id="rId7" o:title=""/>
                 </v:shape>
-                <v:shape style="position:absolute;left:576;top:4749;width:10760;height:272" id="docshape15" coordorigin="576,4750" coordsize="10760,272" path="m6265,4750l576,4750,576,5021,6265,5021,6265,4750xm11335,4750l6277,4750,6277,5021,11335,5021,11335,4750xe" filled="true" fillcolor="#e6e6e8" stroked="false">
+                <v:shape id="Image 16" o:spid="_x0000_s1037" type="#_x0000_t75" style="position:absolute;left:12;top:20574;width:1524;height:2571;visibility:visible;mso-wrap-style:square" o:gfxdata="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">
+                  <v:imagedata r:id="rId8" o:title=""/>
+                </v:shape>
+                <v:shape id="Graphic 17" o:spid="_x0000_s1038" style="position:absolute;top:25389;width:68326;height:1728;visibility:visible;mso-wrap-style:square;v-text-anchor:top" coordsize="6832600,172720" o:gfxdata="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" path="m3612769,l,,,172199r3612769,l3612769,xem6832092,l3620389,r,172199l6832092,172199,6832092,xe" fillcolor="#e6e6e8" stroked="f">
                   <v:path arrowok="t"/>
-                  <v:fill type="solid"/>
                 </v:shape>
-                <v:shape style="position:absolute;left:6272;top:4749;width:2;height:1294" id="docshape16" coordorigin="6273,4750" coordsize="0,1294" path="m6273,4750l6273,5021m6273,5021l6273,5528m6273,5528l6273,5811m6273,5811l6273,6044e" filled="false" stroked="true" strokeweight=".72pt" strokecolor="#c1c1c3">
+                <v:shape id="Graphic 18" o:spid="_x0000_s1039" style="position:absolute;left:36173;top:25389;width:13;height:8217;visibility:visible;mso-wrap-style:square;v-text-anchor:top" coordsize="1270,821690" o:gfxdata="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" path="m,l,172212em,172212l,493775em,493775l,673608em,673608l,821436e" filled="f" strokecolor="#c1c1c3" strokeweight=".72pt">
+                  <v:stroke dashstyle="1 1"/>
                   <v:path arrowok="t"/>
-                  <v:stroke dashstyle="shortdot"/>
                 </v:shape>
-                <v:shape style="position:absolute;left:4045;top:1900;width:7396;height:764" id="docshape17" coordorigin="4045,1901" coordsize="7396,764" path="m4059,1915l4045,1915,4045,2664,4059,2664,4059,1915xm11426,1901l8980,1901,8966,1901,4059,1901,4045,1901,4045,1915,4059,1915,8966,1915,8980,1915,11426,1915,11426,1901xm11441,1901l11426,1901,11426,1915,11441,1915,11441,1901xe" filled="true" fillcolor="#c1c1c3" stroked="false">
+                <v:shape id="Graphic 19" o:spid="_x0000_s1040" style="position:absolute;left:22028;top:7296;width:46964;height:4851;visibility:visible;mso-wrap-style:square;v-text-anchor:top" coordsize="4696460,485140" o:gfxdata="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" path="m9144,9156l,9156,,484632r9144,l9144,9156xem4687176,l3133979,r-9144,l9144,,,,,9144r9144,l3124835,9144r9144,l4687176,9144r,-9144xem4696320,r-9131,l4687189,9144r9131,l4696320,xe" fillcolor="#c1c1c3" stroked="f">
                   <v:path arrowok="t"/>
-                  <v:fill type="solid"/>
                 </v:shape>
-                <v:line style="position:absolute" from="8973,1915" to="8973,2664" stroked="true" strokeweight=".72pt" strokecolor="#c1c1c3">
-                  <v:stroke dashstyle="shortdot"/>
-                </v:line>
-                <v:shape style="position:absolute;left:4045;top:1914;width:7396;height:764" id="docshape18" coordorigin="4045,1915" coordsize="7396,764" path="m4059,2664l4045,2664,4045,2678,4059,2678,4059,2664xm11441,1915l11426,1915,11426,2664,11441,2664,11441,1915xe" filled="true" fillcolor="#c1c1c3" stroked="false">
+                <v:shape id="Graphic 20" o:spid="_x0000_s1041" style="position:absolute;left:53322;top:7387;width:12;height:4756;visibility:visible;mso-wrap-style:square;v-text-anchor:top" coordsize="1270,475615" o:gfxdata="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" path="m,l,475488e" filled="f" strokecolor="#c1c1c3" strokeweight=".72pt">
+                  <v:stroke dashstyle="1 1"/>
                   <v:path arrowok="t"/>
-                  <v:fill type="solid"/>
                 </v:shape>
-                <v:shape style="position:absolute;left:4059;top:2663;width:4914;height:15" id="docshape19" coordorigin="4059,2664" coordsize="4914,15" path="m4059,2671l6505,2671m6505,2671l6520,2671m6520,2671l8966,2671m8973,2664l8973,2678e" filled="false" stroked="true" strokeweight=".72pt" strokecolor="#c1c1c3">
+                <v:shape id="Graphic 21" o:spid="_x0000_s1042" style="position:absolute;left:22028;top:7387;width:46964;height:4852;visibility:visible;mso-wrap-style:square;v-text-anchor:top" coordsize="4696460,485140" o:gfxdata="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" path="m9144,475475r-9144,l,484619r9144,l9144,475475xem4696320,r-9131,l4687189,475475r9131,l4696320,xe" fillcolor="#c1c1c3" stroked="f">
                   <v:path arrowok="t"/>
-                  <v:stroke dashstyle="shortdot"/>
                 </v:shape>
-                <v:shape style="position:absolute;left:4045;top:2663;width:7396;height:2087" id="docshape20" coordorigin="4045,2664" coordsize="7396,2087" path="m4059,2678l4045,2678,4045,4736,4059,4736,4059,2678xm6505,4736l4059,4736,4045,4736,4045,4750,4059,4750,6505,4750,6505,4736xm11441,2664l11426,2664,11426,2678,11441,2678,11441,2664xe" filled="true" fillcolor="#c1c1c3" stroked="false">
+                <v:shape id="Graphic 22" o:spid="_x0000_s1043" style="position:absolute;left:22119;top:12142;width:31204;height:95;visibility:visible;mso-wrap-style:square;v-text-anchor:top" coordsize="3120390,9525" o:gfxdata="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" path="m,4572r1553209,em1553209,4572r9145,em1562354,4572r1553337,em3120263,r,9143e" filled="f" strokecolor="#c1c1c3" strokeweight=".72pt">
+                  <v:stroke dashstyle="1 1"/>
                   <v:path arrowok="t"/>
-                  <v:fill type="solid"/>
                 </v:shape>
-                <v:line style="position:absolute" from="6513,2678" to="6513,4736" stroked="true" strokeweight=".72pt" strokecolor="#c1c1c3">
-                  <v:stroke dashstyle="shortdot"/>
-                </v:line>
-                <v:shape style="position:absolute;left:6505;top:4735;width:2461;height:15" id="docshape21" coordorigin="6505,4736" coordsize="2461,15" path="m8966,4736l6520,4736,6505,4736,6505,4750,6520,4750,8966,4750,8966,4736xe" filled="true" fillcolor="#c1c1c3" stroked="false">
+                <v:shape id="Graphic 23" o:spid="_x0000_s1044" style="position:absolute;left:22028;top:12142;width:46964;height:13252;visibility:visible;mso-wrap-style:square;v-text-anchor:top" coordsize="4696460,1325245" o:gfxdata="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" path="m9144,9271l,9271,,1315593r9144,l9144,9271xem1562354,1315605r-1553210,l,1315605r,9132l9144,1324737r1553210,l1562354,1315605xem4696320,r-9131,l4687189,9144r9131,l4696320,xe" fillcolor="#c1c1c3" stroked="f">
                   <v:path arrowok="t"/>
-                  <v:fill type="solid"/>
                 </v:shape>
-                <v:line style="position:absolute" from="8973,2678" to="8973,4736" stroked="true" strokeweight=".72pt" strokecolor="#c1c1c3">
-                  <v:stroke dashstyle="shortdot"/>
-                </v:line>
-                <v:shape style="position:absolute;left:8966;top:2678;width:2475;height:2072" id="docshape22" coordorigin="8966,2678" coordsize="2475,2072" path="m11426,4736l8980,4736,8966,4736,8966,4750,8980,4750,11426,4750,11426,4736xm11441,4736l11426,4736,11426,4750,11441,4750,11441,4736xm11441,2678l11426,2678,11426,4736,11441,4736,11441,2678xe" filled="true" fillcolor="#c1c1c3" stroked="false">
+                <v:shape id="Graphic 24" o:spid="_x0000_s1045" style="position:absolute;left:37697;top:12233;width:13;height:13069;visibility:visible;mso-wrap-style:square;v-text-anchor:top" coordsize="1270,1306830" o:gfxdata="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" path="m,l,1306449e" filled="f" strokecolor="#c1c1c3" strokeweight=".72pt">
+                  <v:stroke dashstyle="1 1"/>
                   <v:path arrowok="t"/>
-                  <v:fill type="solid"/>
                 </v:shape>
-                <v:shape style="position:absolute;left:1298;top:865;width:4307;height:615" type="#_x0000_t202" id="docshape23" filled="false" stroked="false">
+                <v:shape id="Graphic 25" o:spid="_x0000_s1046" style="position:absolute;left:37651;top:25298;width:15628;height:95;visibility:visible;mso-wrap-style:square;v-text-anchor:top" coordsize="1562735,9525" o:gfxdata="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" path="m1562354,l9144,,,,,9131r9144,l1562354,9131r,-9131xe" fillcolor="#c1c1c3" stroked="f">
+                  <v:path arrowok="t"/>
+                </v:shape>
+                <v:shape id="Graphic 26" o:spid="_x0000_s1047" style="position:absolute;left:53322;top:12233;width:12;height:13069;visibility:visible;mso-wrap-style:square;v-text-anchor:top" coordsize="1270,1306830" o:gfxdata="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" path="m,l,1306449e" filled="f" strokecolor="#c1c1c3" strokeweight=".72pt">
+                  <v:stroke dashstyle="1 1"/>
+                  <v:path arrowok="t"/>
+                </v:shape>
+                <v:shape id="Graphic 27" o:spid="_x0000_s1048" style="position:absolute;left:53276;top:12235;width:15716;height:13157;visibility:visible;mso-wrap-style:square;v-text-anchor:top" coordsize="1571625,1315720" o:gfxdata="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" path="m1562341,1306334r-1553197,l,1306334r,9132l9144,1315466r1553197,l1562341,1306334xem1571485,1306334r-9131,l1562354,1315466r9131,l1571485,1306334xem1571485,r-9131,l1562354,1306322r9131,l1571485,xe" fillcolor="#c1c1c3" stroked="f">
+                  <v:path arrowok="t"/>
+                </v:shape>
+                <v:shape id="Textbox 28" o:spid="_x0000_s1049" type="#_x0000_t202" style="position:absolute;left:4590;top:723;width:27349;height:3905;visibility:visible;mso-wrap-style:square;v-text-anchor:top" o:gfxdata="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" filled="f" stroked="f">
                   <v:textbox inset="0,0,0,0">
                     <w:txbxContent>
                       <w:p>
                         <w:pPr>
-                          <w:spacing w:line="303" w:lineRule="exact" w:before="0"/>
-                          <w:ind w:left="0" w:right="0" w:firstLine="0"/>
-                          <w:jc w:val="left"/>
+                          <w:spacing w:line="303" w:lineRule="exact"/>
                           <w:rPr>
                             <w:rFonts w:ascii="Arial"/>
                             <w:b/>
@@ -3036,7 +3043,7 @@
                             <w:spacing w:val="-3"/>
                             <w:sz w:val="24"/>
                           </w:rPr>
-                          <w:t> </w:t>
+                          <w:t xml:space="preserve"> </w:t>
                         </w:r>
                         <w:r>
                           <w:rPr>
@@ -3055,7 +3062,7 @@
                             <w:spacing w:val="-5"/>
                             <w:sz w:val="27"/>
                           </w:rPr>
-                          <w:t> </w:t>
+                          <w:t xml:space="preserve"> </w:t>
                         </w:r>
                         <w:r>
                           <w:rPr>
@@ -3074,7 +3081,7 @@
                             <w:spacing w:val="-4"/>
                             <w:sz w:val="27"/>
                           </w:rPr>
-                          <w:t> </w:t>
+                          <w:t xml:space="preserve"> </w:t>
                         </w:r>
                         <w:r>
                           <w:rPr>
@@ -3093,7 +3100,7 @@
                             <w:spacing w:val="-3"/>
                             <w:sz w:val="27"/>
                           </w:rPr>
-                          <w:t> </w:t>
+                          <w:t xml:space="preserve"> </w:t>
                         </w:r>
                         <w:r>
                           <w:rPr>
@@ -3109,8 +3116,6 @@
                       <w:p>
                         <w:pPr>
                           <w:spacing w:before="105"/>
-                          <w:ind w:left="0" w:right="0" w:firstLine="0"/>
-                          <w:jc w:val="left"/>
                           <w:rPr>
                             <w:sz w:val="18"/>
                           </w:rPr>
@@ -3128,7 +3133,7 @@
                             <w:spacing w:val="-3"/>
                             <w:sz w:val="18"/>
                           </w:rPr>
-                          <w:t> </w:t>
+                          <w:t xml:space="preserve"> </w:t>
                         </w:r>
                         <w:r>
                           <w:rPr>
@@ -3143,7 +3148,7 @@
                             <w:spacing w:val="-1"/>
                             <w:sz w:val="18"/>
                           </w:rPr>
-                          <w:t> </w:t>
+                          <w:t xml:space="preserve"> </w:t>
                         </w:r>
                         <w:r>
                           <w:rPr>
@@ -3158,7 +3163,7 @@
                             <w:spacing w:val="-3"/>
                             <w:sz w:val="18"/>
                           </w:rPr>
-                          <w:t> </w:t>
+                          <w:t xml:space="preserve"> </w:t>
                         </w:r>
                         <w:r>
                           <w:rPr>
@@ -3173,7 +3178,7 @@
                             <w:spacing w:val="-3"/>
                             <w:sz w:val="18"/>
                           </w:rPr>
-                          <w:t> </w:t>
+                          <w:t xml:space="preserve"> </w:t>
                         </w:r>
                         <w:r>
                           <w:rPr>
@@ -3188,7 +3193,7 @@
                             <w:spacing w:val="-5"/>
                             <w:sz w:val="18"/>
                           </w:rPr>
-                          <w:t> </w:t>
+                          <w:t xml:space="preserve"> </w:t>
                         </w:r>
                         <w:r>
                           <w:rPr>
@@ -3203,21 +3208,18 @@
                             <w:spacing w:val="-2"/>
                             <w:sz w:val="18"/>
                           </w:rPr>
-                          <w:t> departure</w:t>
+                          <w:t xml:space="preserve"> departure</w:t>
                         </w:r>
                       </w:p>
                     </w:txbxContent>
                   </v:textbox>
-                  <w10:wrap type="none"/>
                 </v:shape>
-                <v:shape style="position:absolute;left:4215;top:1993;width:1476;height:512" type="#_x0000_t202" id="docshape24" filled="false" stroked="false">
+                <v:shape id="Textbox 29" o:spid="_x0000_s1050" type="#_x0000_t202" style="position:absolute;left:23110;top:7886;width:9372;height:3251;visibility:visible;mso-wrap-style:square;v-text-anchor:top" o:gfxdata="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" filled="f" stroked="f">
                   <v:textbox inset="0,0,0,0">
                     <w:txbxContent>
                       <w:p>
                         <w:pPr>
-                          <w:spacing w:line="303" w:lineRule="exact" w:before="0"/>
-                          <w:ind w:left="0" w:right="0" w:firstLine="0"/>
-                          <w:jc w:val="left"/>
+                          <w:spacing w:line="303" w:lineRule="exact"/>
                           <w:rPr>
                             <w:sz w:val="27"/>
                           </w:rPr>
@@ -3234,8 +3236,6 @@
                       <w:p>
                         <w:pPr>
                           <w:spacing w:before="2"/>
-                          <w:ind w:left="0" w:right="0" w:firstLine="0"/>
-                          <w:jc w:val="left"/>
                           <w:rPr>
                             <w:sz w:val="18"/>
                           </w:rPr>
@@ -3254,7 +3254,7 @@
                             <w:spacing w:val="-6"/>
                             <w:sz w:val="18"/>
                           </w:rPr>
-                          <w:t> </w:t>
+                          <w:t xml:space="preserve"> </w:t>
                         </w:r>
                         <w:r>
                           <w:rPr>
@@ -3267,16 +3267,13 @@
                       </w:p>
                     </w:txbxContent>
                   </v:textbox>
-                  <w10:wrap type="none"/>
                 </v:shape>
-                <v:shape style="position:absolute;left:6795;top:1993;width:1377;height:512" type="#_x0000_t202" id="docshape25" filled="false" stroked="false">
+                <v:shape id="Textbox 30" o:spid="_x0000_s1051" type="#_x0000_t202" style="position:absolute;left:39495;top:7886;width:8744;height:3251;visibility:visible;mso-wrap-style:square;v-text-anchor:top" o:gfxdata="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" filled="f" stroked="f">
                   <v:textbox inset="0,0,0,0">
                     <w:txbxContent>
                       <w:p>
                         <w:pPr>
-                          <w:spacing w:line="303" w:lineRule="exact" w:before="0"/>
-                          <w:ind w:left="0" w:right="0" w:firstLine="0"/>
-                          <w:jc w:val="left"/>
+                          <w:spacing w:line="303" w:lineRule="exact"/>
                           <w:rPr>
                             <w:sz w:val="27"/>
                           </w:rPr>
@@ -3293,8 +3290,6 @@
                       <w:p>
                         <w:pPr>
                           <w:spacing w:before="2"/>
-                          <w:ind w:left="0" w:right="0" w:firstLine="0"/>
-                          <w:jc w:val="left"/>
                           <w:rPr>
                             <w:sz w:val="18"/>
                           </w:rPr>
@@ -3312,21 +3307,18 @@
                             <w:spacing w:val="-4"/>
                             <w:sz w:val="18"/>
                           </w:rPr>
-                          <w:t> CHINA</w:t>
+                          <w:t xml:space="preserve"> CHINA</w:t>
                         </w:r>
                       </w:p>
                     </w:txbxContent>
                   </v:textbox>
-                  <w10:wrap type="none"/>
                 </v:shape>
-                <v:shape style="position:absolute;left:9136;top:1991;width:1710;height:619" type="#_x0000_t202" id="docshape26" filled="false" stroked="false">
+                <v:shape id="Textbox 31" o:spid="_x0000_s1052" type="#_x0000_t202" style="position:absolute;left:54358;top:7876;width:10859;height:3931;visibility:visible;mso-wrap-style:square;v-text-anchor:top" o:gfxdata="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" filled="f" stroked="f">
                   <v:textbox inset="0,0,0,0">
                     <w:txbxContent>
                       <w:p>
                         <w:pPr>
-                          <w:spacing w:line="201" w:lineRule="exact" w:before="0"/>
-                          <w:ind w:left="0" w:right="0" w:firstLine="0"/>
-                          <w:jc w:val="left"/>
+                          <w:spacing w:line="201" w:lineRule="exact"/>
                           <w:rPr>
                             <w:sz w:val="18"/>
                           </w:rPr>
@@ -3343,8 +3335,7 @@
                       <w:p>
                         <w:pPr>
                           <w:spacing w:before="2"/>
-                          <w:ind w:left="0" w:right="12" w:firstLine="0"/>
-                          <w:jc w:val="left"/>
+                          <w:ind w:right="12"/>
                           <w:rPr>
                             <w:sz w:val="18"/>
                           </w:rPr>
@@ -3362,7 +3353,7 @@
                             <w:spacing w:val="-13"/>
                             <w:sz w:val="18"/>
                           </w:rPr>
-                          <w:t> </w:t>
+                          <w:t xml:space="preserve"> </w:t>
                         </w:r>
                         <w:r>
                           <w:rPr>
@@ -3374,16 +3365,13 @@
                       </w:p>
                     </w:txbxContent>
                   </v:textbox>
-                  <w10:wrap type="none"/>
                 </v:shape>
-                <v:shape style="position:absolute;left:4215;top:2757;width:1082;height:1083" type="#_x0000_t202" id="docshape27" filled="false" stroked="false">
+                <v:shape id="Textbox 32" o:spid="_x0000_s1053" type="#_x0000_t202" style="position:absolute;left:23110;top:12738;width:6870;height:6877;visibility:visible;mso-wrap-style:square;v-text-anchor:top" o:gfxdata="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" filled="f" stroked="f">
                   <v:textbox inset="0,0,0,0">
                     <w:txbxContent>
                       <w:p>
                         <w:pPr>
-                          <w:spacing w:line="201" w:lineRule="exact" w:before="0"/>
-                          <w:ind w:left="0" w:right="0" w:firstLine="0"/>
-                          <w:jc w:val="left"/>
+                          <w:spacing w:line="201" w:lineRule="exact"/>
                           <w:rPr>
                             <w:sz w:val="18"/>
                           </w:rPr>
@@ -3401,14 +3389,12 @@
                             <w:spacing w:val="-5"/>
                             <w:sz w:val="18"/>
                           </w:rPr>
-                          <w:t> At:</w:t>
+                          <w:t xml:space="preserve"> At:</w:t>
                         </w:r>
                       </w:p>
                       <w:p>
                         <w:pPr>
                           <w:spacing w:before="6"/>
-                          <w:ind w:left="0" w:right="0" w:firstLine="0"/>
-                          <w:jc w:val="left"/>
                           <w:rPr>
                             <w:sz w:val="27"/>
                           </w:rPr>
@@ -3424,9 +3410,8 @@
                       </w:p>
                       <w:p>
                         <w:pPr>
-                          <w:spacing w:line="242" w:lineRule="auto" w:before="147"/>
-                          <w:ind w:left="0" w:right="14" w:firstLine="0"/>
-                          <w:jc w:val="left"/>
+                          <w:spacing w:before="147" w:line="242" w:lineRule="auto"/>
+                          <w:ind w:right="14"/>
                           <w:rPr>
                             <w:sz w:val="18"/>
                           </w:rPr>
@@ -3437,7 +3422,7 @@
                             <w:spacing w:val="-2"/>
                             <w:sz w:val="18"/>
                           </w:rPr>
-                          <w:t>Terminal: </w:t>
+                          <w:t xml:space="preserve">Terminal: </w:t>
                         </w:r>
                         <w:r>
                           <w:rPr>
@@ -3452,7 +3437,7 @@
                             <w:spacing w:val="-13"/>
                             <w:sz w:val="18"/>
                           </w:rPr>
-                          <w:t> </w:t>
+                          <w:t xml:space="preserve"> </w:t>
                         </w:r>
                         <w:r>
                           <w:rPr>
@@ -3464,16 +3449,13 @@
                       </w:p>
                     </w:txbxContent>
                   </v:textbox>
-                  <w10:wrap type="none"/>
                 </v:shape>
-                <v:shape style="position:absolute;left:6675;top:2757;width:1082;height:1083" type="#_x0000_t202" id="docshape28" filled="false" stroked="false">
+                <v:shape id="Textbox 33" o:spid="_x0000_s1054" type="#_x0000_t202" style="position:absolute;left:38733;top:12738;width:6871;height:6877;visibility:visible;mso-wrap-style:square;v-text-anchor:top" o:gfxdata="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" filled="f" stroked="f">
                   <v:textbox inset="0,0,0,0">
                     <w:txbxContent>
                       <w:p>
                         <w:pPr>
-                          <w:spacing w:line="201" w:lineRule="exact" w:before="0"/>
-                          <w:ind w:left="0" w:right="0" w:firstLine="0"/>
-                          <w:jc w:val="left"/>
+                          <w:spacing w:line="201" w:lineRule="exact"/>
                           <w:rPr>
                             <w:sz w:val="18"/>
                           </w:rPr>
@@ -3491,7 +3473,7 @@
                             <w:spacing w:val="-4"/>
                             <w:sz w:val="18"/>
                           </w:rPr>
-                          <w:t> </w:t>
+                          <w:t xml:space="preserve"> </w:t>
                         </w:r>
                         <w:r>
                           <w:rPr>
@@ -3505,8 +3487,6 @@
                       <w:p>
                         <w:pPr>
                           <w:spacing w:before="6"/>
-                          <w:ind w:left="0" w:right="0" w:firstLine="0"/>
-                          <w:jc w:val="left"/>
                           <w:rPr>
                             <w:sz w:val="27"/>
                           </w:rPr>
@@ -3522,9 +3502,8 @@
                       </w:p>
                       <w:p>
                         <w:pPr>
-                          <w:spacing w:line="242" w:lineRule="auto" w:before="147"/>
-                          <w:ind w:left="0" w:right="14" w:firstLine="0"/>
-                          <w:jc w:val="left"/>
+                          <w:spacing w:before="147" w:line="242" w:lineRule="auto"/>
+                          <w:ind w:right="14"/>
                           <w:rPr>
                             <w:sz w:val="18"/>
                           </w:rPr>
@@ -3535,7 +3514,7 @@
                             <w:spacing w:val="-2"/>
                             <w:sz w:val="18"/>
                           </w:rPr>
-                          <w:t>Terminal: </w:t>
+                          <w:t xml:space="preserve">Terminal: </w:t>
                         </w:r>
                         <w:r>
                           <w:rPr>
@@ -3550,7 +3529,7 @@
                             <w:spacing w:val="-13"/>
                             <w:sz w:val="18"/>
                           </w:rPr>
-                          <w:t> </w:t>
+                          <w:t xml:space="preserve"> </w:t>
                         </w:r>
                         <w:r>
                           <w:rPr>
@@ -3562,16 +3541,14 @@
                       </w:p>
                     </w:txbxContent>
                   </v:textbox>
-                  <w10:wrap type="none"/>
                 </v:shape>
-                <v:shape style="position:absolute;left:9136;top:2771;width:970;height:828" type="#_x0000_t202" id="docshape29" filled="false" stroked="false">
+                <v:shape id="Textbox 34" o:spid="_x0000_s1055" type="#_x0000_t202" style="position:absolute;left:54358;top:12829;width:6160;height:5258;visibility:visible;mso-wrap-style:square;v-text-anchor:top" o:gfxdata="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" filled="f" stroked="f">
                   <v:textbox inset="0,0,0,0">
                     <w:txbxContent>
                       <w:p>
                         <w:pPr>
-                          <w:spacing w:line="242" w:lineRule="auto" w:before="0"/>
-                          <w:ind w:left="0" w:right="18" w:firstLine="0"/>
-                          <w:jc w:val="left"/>
+                          <w:spacing w:line="242" w:lineRule="auto"/>
+                          <w:ind w:right="18"/>
                           <w:rPr>
                             <w:sz w:val="18"/>
                           </w:rPr>
@@ -3589,14 +3566,14 @@
                             <w:spacing w:val="-13"/>
                             <w:sz w:val="18"/>
                           </w:rPr>
-                          <w:t> </w:t>
-                        </w:r>
-                        <w:r>
-                          <w:rPr>
-                            <w:color w:val="333333"/>
-                            <w:sz w:val="18"/>
-                          </w:rPr>
-                          <w:t>(in </w:t>
+                          <w:t xml:space="preserve"> </w:t>
+                        </w:r>
+                        <w:r>
+                          <w:rPr>
+                            <w:color w:val="333333"/>
+                            <w:sz w:val="18"/>
+                          </w:rPr>
+                          <w:t xml:space="preserve">(in </w:t>
                         </w:r>
                         <w:r>
                           <w:rPr>
@@ -3609,16 +3586,13 @@
                       </w:p>
                     </w:txbxContent>
                   </v:textbox>
-                  <w10:wrap type="none"/>
                 </v:shape>
-                <v:shape style="position:absolute;left:10711;top:2771;width:424;height:202" type="#_x0000_t202" id="docshape30" filled="false" stroked="false">
+                <v:shape id="Textbox 35" o:spid="_x0000_s1056" type="#_x0000_t202" style="position:absolute;left:64358;top:12829;width:2692;height:1283;visibility:visible;mso-wrap-style:square;v-text-anchor:top" o:gfxdata="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" filled="f" stroked="f">
                   <v:textbox inset="0,0,0,0">
                     <w:txbxContent>
                       <w:p>
                         <w:pPr>
-                          <w:spacing w:line="201" w:lineRule="exact" w:before="0"/>
-                          <w:ind w:left="0" w:right="0" w:firstLine="0"/>
-                          <w:jc w:val="left"/>
+                          <w:spacing w:line="201" w:lineRule="exact"/>
                           <w:rPr>
                             <w:sz w:val="18"/>
                           </w:rPr>
@@ -3634,16 +3608,14 @@
                       </w:p>
                     </w:txbxContent>
                   </v:textbox>
-                  <w10:wrap type="none"/>
                 </v:shape>
-                <v:shape style="position:absolute;left:576;top:4781;width:1896;height:470" type="#_x0000_t202" id="docshape31" filled="false" stroked="false">
+                <v:shape id="Textbox 36" o:spid="_x0000_s1057" type="#_x0000_t202" style="position:absolute;top:25589;width:12039;height:2985;visibility:visible;mso-wrap-style:square;v-text-anchor:top" o:gfxdata="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" filled="f" stroked="f">
                   <v:textbox inset="0,0,0,0">
                     <w:txbxContent>
                       <w:p>
                         <w:pPr>
-                          <w:spacing w:line="201" w:lineRule="exact" w:before="0"/>
-                          <w:ind w:left="31" w:right="0" w:firstLine="0"/>
-                          <w:jc w:val="left"/>
+                          <w:spacing w:line="201" w:lineRule="exact"/>
+                          <w:ind w:left="31"/>
                           <w:rPr>
                             <w:sz w:val="18"/>
                           </w:rPr>
@@ -3661,7 +3633,7 @@
                             <w:spacing w:val="-5"/>
                             <w:sz w:val="18"/>
                           </w:rPr>
-                          <w:t> </w:t>
+                          <w:t xml:space="preserve"> </w:t>
                         </w:r>
                         <w:r>
                           <w:rPr>
@@ -3675,8 +3647,6 @@
                       <w:p>
                         <w:pPr>
                           <w:spacing w:before="38"/>
-                          <w:ind w:left="0" w:right="0" w:firstLine="0"/>
-                          <w:jc w:val="left"/>
                           <w:rPr>
                             <w:sz w:val="20"/>
                           </w:rPr>
@@ -3692,7 +3662,7 @@
                             <w:spacing w:val="-6"/>
                             <w:sz w:val="20"/>
                           </w:rPr>
-                          <w:t> </w:t>
+                          <w:t xml:space="preserve"> </w:t>
                         </w:r>
                         <w:r>
                           <w:rPr>
@@ -3705,7 +3675,7 @@
                             <w:spacing w:val="-7"/>
                             <w:sz w:val="20"/>
                           </w:rPr>
-                          <w:t> </w:t>
+                          <w:t xml:space="preserve"> </w:t>
                         </w:r>
                         <w:r>
                           <w:rPr>
@@ -3717,16 +3687,14 @@
                       </w:p>
                     </w:txbxContent>
                   </v:textbox>
-                  <w10:wrap type="none"/>
                 </v:shape>
-                <v:shape style="position:absolute;left:6277;top:4781;width:1857;height:493" type="#_x0000_t202" id="docshape32" filled="false" stroked="false">
+                <v:shape id="Textbox 37" o:spid="_x0000_s1058" type="#_x0000_t202" style="position:absolute;left:36203;top:25589;width:11792;height:3131;visibility:visible;mso-wrap-style:square;v-text-anchor:top" o:gfxdata="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" filled="f" stroked="f">
                   <v:textbox inset="0,0,0,0">
                     <w:txbxContent>
                       <w:p>
                         <w:pPr>
-                          <w:spacing w:line="201" w:lineRule="exact" w:before="0"/>
-                          <w:ind w:left="28" w:right="0" w:firstLine="0"/>
-                          <w:jc w:val="left"/>
+                          <w:spacing w:line="201" w:lineRule="exact"/>
+                          <w:ind w:left="28"/>
                           <w:rPr>
                             <w:sz w:val="18"/>
                           </w:rPr>
@@ -3743,45 +3711,33 @@
                       <w:p>
                         <w:pPr>
                           <w:spacing w:before="38"/>
-                          <w:ind w:left="0" w:right="0" w:firstLine="0"/>
-                          <w:jc w:val="left"/>
-                          <w:rPr>
-                            <w:sz w:val="22"/>
-                          </w:rPr>
                         </w:pPr>
                         <w:r>
-                          <w:rPr>
-                            <w:sz w:val="22"/>
-                          </w:rPr>
                           <w:t>Check-In</w:t>
                         </w:r>
                         <w:r>
                           <w:rPr>
                             <w:spacing w:val="-6"/>
-                            <w:sz w:val="22"/>
-                          </w:rPr>
-                          <w:t> </w:t>
+                          </w:rPr>
+                          <w:t xml:space="preserve"> </w:t>
                         </w:r>
                         <w:r>
                           <w:rPr>
                             <w:spacing w:val="-2"/>
-                            <w:sz w:val="22"/>
                           </w:rPr>
                           <w:t>Required</w:t>
                         </w:r>
                       </w:p>
                     </w:txbxContent>
                   </v:textbox>
-                  <w10:wrap type="none"/>
                 </v:shape>
-                <v:shape style="position:absolute;left:578;top:1486;width:3315;height:2835" type="#_x0000_t202" id="docshape33" filled="false" stroked="false">
+                <v:shape id="Textbox 38" o:spid="_x0000_s1059" type="#_x0000_t202" style="position:absolute;left:12;top:4667;width:21050;height:18002;visibility:visible;mso-wrap-style:square;v-text-anchor:top" o:gfxdata="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" filled="f" stroked="f">
                   <v:textbox inset="0,0,0,0">
                     <w:txbxContent>
                       <w:p>
                         <w:pPr>
                           <w:spacing w:before="76"/>
-                          <w:ind w:left="151" w:right="0" w:firstLine="0"/>
-                          <w:jc w:val="left"/>
+                          <w:ind w:left="151"/>
                           <w:rPr>
                             <w:sz w:val="27"/>
                           </w:rPr>
@@ -3799,7 +3755,7 @@
                             <w:spacing w:val="-7"/>
                             <w:sz w:val="27"/>
                           </w:rPr>
-                          <w:t> </w:t>
+                          <w:t xml:space="preserve"> </w:t>
                         </w:r>
                         <w:r>
                           <w:rPr>
@@ -3813,11 +3769,12 @@
                       <w:p>
                         <w:pPr>
                           <w:spacing w:before="4"/>
-                          <w:ind w:left="151" w:right="0" w:firstLine="0"/>
-                          <w:jc w:val="left"/>
+                          <w:ind w:left="151"/>
                           <w:rPr>
                             <w:rFonts w:ascii="Arial"/>
                             <w:b/>
+                            <w:color w:val="333333"/>
+                            <w:spacing w:val="-4"/>
                             <w:sz w:val="27"/>
                           </w:rPr>
                         </w:pPr>
@@ -3835,10 +3792,9 @@
                             <w:rFonts w:ascii="Arial"/>
                             <w:b/>
                             <w:color w:val="333333"/>
-                            <w:spacing w:val="-1"/>
                             <w:sz w:val="27"/>
                           </w:rPr>
-                          <w:t> </w:t>
+                          <w:t xml:space="preserve"> </w:t>
                         </w:r>
                         <w:r>
                           <w:rPr>
@@ -3848,14 +3804,57 @@
                             <w:spacing w:val="-4"/>
                             <w:sz w:val="27"/>
                           </w:rPr>
-                          <w:t>0512</w:t>
+                          <w:t>{{</w:t>
+                        </w:r>
+                        <w:r>
+                          <w:rPr>
+                            <w:rFonts w:ascii="Consolas" w:eastAsia="Times New Roman" w:hAnsi="Consolas" w:cs="Times New Roman"/>
+                            <w:color w:val="A5D6FF"/>
+                            <w:sz w:val="21"/>
+                            <w:szCs w:val="21"/>
+                          </w:rPr>
+                          <w:t xml:space="preserve"> </w:t>
+                        </w:r>
+                        <w:proofErr w:type="spellStart"/>
+                        <w:r>
+                          <w:rPr>
+                            <w:rFonts w:ascii="Arial"/>
+                            <w:b/>
+                            <w:color w:val="333333"/>
+                            <w:spacing w:val="-4"/>
+                            <w:sz w:val="27"/>
+                          </w:rPr>
+                          <w:t>arrive_flight_number</w:t>
+                        </w:r>
+                        <w:proofErr w:type="spellEnd"/>
+                      </w:p>
+                      <w:p>
+                        <w:pPr>
+                          <w:spacing w:before="4"/>
+                          <w:ind w:left="151"/>
+                          <w:rPr>
+                            <w:rFonts w:ascii="Arial"/>
+                            <w:b/>
+                            <w:color w:val="333333"/>
+                            <w:spacing w:val="-4"/>
+                            <w:sz w:val="27"/>
+                          </w:rPr>
+                        </w:pPr>
+                        <w:r>
+                          <w:rPr>
+                            <w:rFonts w:ascii="Arial"/>
+                            <w:b/>
+                            <w:color w:val="333333"/>
+                            <w:spacing w:val="-4"/>
+                            <w:sz w:val="27"/>
+                          </w:rPr>
+                          <w:t>}}</w:t>
                         </w:r>
                       </w:p>
                       <w:p>
                         <w:pPr>
                           <w:spacing w:before="149"/>
-                          <w:ind w:left="151" w:right="1949" w:firstLine="0"/>
-                          <w:jc w:val="left"/>
+                          <w:ind w:left="151" w:right="1949"/>
                           <w:rPr>
                             <w:sz w:val="18"/>
                           </w:rPr>
@@ -3874,7 +3873,7 @@
                             <w:spacing w:val="40"/>
                             <w:sz w:val="18"/>
                           </w:rPr>
-                          <w:t> </w:t>
+                          <w:t xml:space="preserve"> </w:t>
                         </w:r>
                         <w:r>
                           <w:rPr>
@@ -3890,7 +3889,7 @@
                             <w:spacing w:val="-11"/>
                             <w:sz w:val="18"/>
                           </w:rPr>
-                          <w:t> </w:t>
+                          <w:t xml:space="preserve"> </w:t>
                         </w:r>
                         <w:r>
                           <w:rPr>
@@ -3904,8 +3903,7 @@
                       <w:p>
                         <w:pPr>
                           <w:spacing w:before="155"/>
-                          <w:ind w:left="151" w:right="1949" w:firstLine="0"/>
-                          <w:jc w:val="left"/>
+                          <w:ind w:left="151" w:right="1949"/>
                           <w:rPr>
                             <w:sz w:val="18"/>
                           </w:rPr>
@@ -3916,7 +3914,7 @@
                             <w:spacing w:val="-2"/>
                             <w:sz w:val="18"/>
                           </w:rPr>
-                          <w:t>Cabin: </w:t>
+                          <w:t xml:space="preserve">Cabin: </w:t>
                         </w:r>
                         <w:r>
                           <w:rPr>
@@ -3931,7 +3929,7 @@
                             <w:spacing w:val="-15"/>
                             <w:sz w:val="18"/>
                           </w:rPr>
-                          <w:t> </w:t>
+                          <w:t xml:space="preserve"> </w:t>
                         </w:r>
                         <w:r>
                           <w:rPr>
@@ -3946,7 +3944,7 @@
                             <w:spacing w:val="-12"/>
                             <w:sz w:val="18"/>
                           </w:rPr>
-                          <w:t> </w:t>
+                          <w:t xml:space="preserve"> </w:t>
                         </w:r>
                         <w:r>
                           <w:rPr>
@@ -3958,9 +3956,8 @@
                       </w:p>
                       <w:p>
                         <w:pPr>
-                          <w:spacing w:line="244" w:lineRule="auto" w:before="155"/>
-                          <w:ind w:left="151" w:right="1949" w:firstLine="0"/>
-                          <w:jc w:val="left"/>
+                          <w:spacing w:before="155" w:line="244" w:lineRule="auto"/>
+                          <w:ind w:left="151" w:right="1949"/>
                           <w:rPr>
                             <w:sz w:val="18"/>
                           </w:rPr>
@@ -3976,9 +3973,8 @@
                       </w:p>
                     </w:txbxContent>
                   </v:textbox>
-                  <w10:wrap type="none"/>
                 </v:shape>
-                <w10:wrap type="topAndBottom"/>
+                <w10:wrap type="topAndBottom" anchorx="page"/>
               </v:group>
             </w:pict>
           </mc:Fallback>
@@ -3988,23 +3984,22 @@
         <w:rPr>
           <w:rFonts w:ascii="Arial"/>
           <w:b/>
-          <w:sz w:val="22"/>
         </w:rPr>
-        <w:t>BUI PHUONG THAO </w:t>
+        <w:t xml:space="preserve">BUI PHUONG THAO </w:t>
       </w:r>
       <w:r>
         <w:rPr>
           <w:color w:val="333333"/>
           <w:sz w:val="21"/>
         </w:rPr>
-        <w:t>RESERVATION CODE </w:t>
+        <w:t xml:space="preserve">RESERVATION CODE </w:t>
       </w:r>
       <w:r>
         <w:rPr>
           <w:color w:val="333333"/>
           <w:sz w:val="18"/>
         </w:rPr>
-        <w:t>JKHJCM </w:t>
+        <w:t xml:space="preserve">JKHJCM </w:t>
       </w:r>
       <w:r>
         <w:rPr>
@@ -4019,7 +4014,7 @@
           <w:spacing w:val="-15"/>
           <w:sz w:val="21"/>
         </w:rPr>
-        <w:t> </w:t>
+        <w:t xml:space="preserve"> </w:t>
       </w:r>
       <w:r>
         <w:rPr>
@@ -4034,7 +4029,7 @@
           <w:spacing w:val="-15"/>
           <w:sz w:val="21"/>
         </w:rPr>
-        <w:t> </w:t>
+        <w:t xml:space="preserve"> </w:t>
       </w:r>
       <w:r>
         <w:rPr>
@@ -4049,7 +4044,7 @@
           <w:spacing w:val="-14"/>
           <w:sz w:val="21"/>
         </w:rPr>
-        <w:t> </w:t>
+        <w:t xml:space="preserve"> </w:t>
       </w:r>
       <w:r>
         <w:rPr>
@@ -4076,7 +4071,7 @@
           <w:color w:val="333333"/>
           <w:spacing w:val="-15"/>
         </w:rPr>
-        <w:t> </w:t>
+        <w:t xml:space="preserve"> </w:t>
       </w:r>
       <w:r>
         <w:rPr>
@@ -4089,7 +4084,7 @@
           <w:color w:val="333333"/>
           <w:spacing w:val="-14"/>
         </w:rPr>
-        <w:t> </w:t>
+        <w:t xml:space="preserve"> </w:t>
       </w:r>
       <w:r>
         <w:rPr>
@@ -4102,7 +4097,7 @@
           <w:color w:val="333333"/>
           <w:spacing w:val="-13"/>
         </w:rPr>
-        <w:t> </w:t>
+        <w:t xml:space="preserve"> </w:t>
       </w:r>
       <w:r>
         <w:rPr>
@@ -4115,7 +4110,7 @@
           <w:color w:val="333333"/>
           <w:spacing w:val="-14"/>
         </w:rPr>
-        <w:t> </w:t>
+        <w:t xml:space="preserve"> </w:t>
       </w:r>
       <w:r>
         <w:rPr>
@@ -4128,7 +4123,7 @@
           <w:color w:val="333333"/>
           <w:spacing w:val="-14"/>
         </w:rPr>
-        <w:t> </w:t>
+        <w:t xml:space="preserve"> </w:t>
       </w:r>
       <w:r>
         <w:rPr>
@@ -4166,24 +4161,13 @@
     <w:tbl>
       <w:tblPr>
         <w:tblW w:w="0" w:type="auto"/>
-        <w:jc w:val="left"/>
         <w:tblInd w:w="164" w:type="dxa"/>
-        <w:tblBorders>
-          <w:top w:val="none" w:sz="0" w:space="0" w:color="auto"/>
-          <w:left w:val="none" w:sz="0" w:space="0" w:color="auto"/>
-          <w:bottom w:val="none" w:sz="0" w:space="0" w:color="auto"/>
-          <w:right w:val="none" w:sz="0" w:space="0" w:color="auto"/>
-          <w:insideH w:val="none" w:sz="0" w:space="0" w:color="auto"/>
-          <w:insideV w:val="none" w:sz="0" w:space="0" w:color="auto"/>
-        </w:tblBorders>
         <w:tblLayout w:type="fixed"/>
         <w:tblCellMar>
-          <w:top w:w="0" w:type="dxa"/>
           <w:left w:w="0" w:type="dxa"/>
-          <w:bottom w:w="0" w:type="dxa"/>
           <w:right w:w="0" w:type="dxa"/>
         </w:tblCellMar>
-        <w:tblLook w:val="01E0"/>
+        <w:tblLook w:val="01E0" w:firstRow="1" w:lastRow="1" w:firstColumn="1" w:lastColumn="1" w:noHBand="0" w:noVBand="0"/>
       </w:tblPr>
       <w:tblGrid>
         <w:gridCol w:w="3375"/>
@@ -4193,7 +4177,7 @@
       </w:tblGrid>
       <w:tr>
         <w:trPr>
-          <w:trHeight w:val="748" w:hRule="atLeast"/>
+          <w:trHeight w:val="748"/>
         </w:trPr>
         <w:tc>
           <w:tcPr>
@@ -4223,7 +4207,7 @@
                 <w:spacing w:val="-7"/>
                 <w:sz w:val="27"/>
               </w:rPr>
-              <w:t> </w:t>
+              <w:t xml:space="preserve"> </w:t>
             </w:r>
             <w:r>
               <w:rPr>
@@ -4241,6 +4225,8 @@
               <w:rPr>
                 <w:rFonts w:ascii="Arial"/>
                 <w:b/>
+                <w:color w:val="333333"/>
+                <w:spacing w:val="-4"/>
                 <w:sz w:val="27"/>
               </w:rPr>
             </w:pPr>
@@ -4261,7 +4247,7 @@
                 <w:spacing w:val="-1"/>
                 <w:sz w:val="27"/>
               </w:rPr>
-              <w:t> </w:t>
+              <w:t xml:space="preserve"> </w:t>
             </w:r>
             <w:r>
               <w:rPr>
@@ -4271,7 +4257,49 @@
                 <w:spacing w:val="-4"/>
                 <w:sz w:val="27"/>
               </w:rPr>
-              <w:t>0507</w:t>
+              <w:t>{{</w:t>
+            </w:r>
+            <w:r>
+              <w:rPr>
+                <w:rFonts w:ascii="Consolas" w:eastAsia="Times New Roman" w:hAnsi="Consolas" w:cs="Times New Roman"/>
+                <w:color w:val="A5D6FF"/>
+                <w:sz w:val="21"/>
+                <w:szCs w:val="21"/>
+              </w:rPr>
+              <w:t xml:space="preserve"> </w:t>
+            </w:r>
+            <w:proofErr w:type="spellStart"/>
+            <w:r>
+              <w:rPr>
+                <w:rFonts w:ascii="Arial"/>
+                <w:b/>
+                <w:color w:val="333333"/>
+                <w:spacing w:val="-4"/>
+                <w:sz w:val="27"/>
+              </w:rPr>
+              <w:t>departure_flight_number</w:t>
+            </w:r>
+            <w:proofErr w:type="spellEnd"/>
+          </w:p>
+          <w:p>
+            <w:pPr>
+              <w:pStyle w:val="TableParagraph"/>
+              <w:spacing w:before="3"/>
+              <w:rPr>
+                <w:rFonts w:ascii="Arial"/>
+                <w:b/>
+                <w:color w:val="333333"/>
+                <w:spacing w:val="-4"/>
+                <w:sz w:val="27"/>
+              </w:rPr>
+            </w:pPr>
+            <w:r>
+              <w:rPr>
+                <w:rFonts w:ascii="Arial"/>
+                <w:b/>
+                <w:sz w:val="27"/>
+              </w:rPr>
+              <w:t>}}</w:t>
             </w:r>
           </w:p>
         </w:tc>
@@ -4323,7 +4351,7 @@
                 <w:spacing w:val="2"/>
                 <w:sz w:val="18"/>
               </w:rPr>
-              <w:t> </w:t>
+              <w:t xml:space="preserve"> </w:t>
             </w:r>
             <w:r>
               <w:rPr>
@@ -4373,12 +4401,13 @@
             </w:pPr>
             <w:r>
               <w:rPr>
+                <w:noProof/>
                 <w:sz w:val="18"/>
               </w:rPr>
               <mc:AlternateContent>
-                <mc:Choice Requires="wps">
+                <mc:Choice Requires="wpg">
                   <w:drawing>
-                    <wp:anchor distT="0" distB="0" distL="0" distR="0" allowOverlap="1" layoutInCell="1" locked="0" behindDoc="1" simplePos="0" relativeHeight="487484928">
+                    <wp:anchor distT="0" distB="0" distL="0" distR="0" simplePos="0" relativeHeight="487484928" behindDoc="1" locked="0" layoutInCell="1" allowOverlap="1" wp14:anchorId="5A467C25" wp14:editId="5D157254">
                       <wp:simplePos x="0" y="0"/>
                       <wp:positionH relativeFrom="column">
                         <wp:posOffset>79882</wp:posOffset>
@@ -4391,27 +4420,29 @@
                       <wp:wrapNone/>
                       <wp:docPr id="39" name="Group 39"/>
                       <wp:cNvGraphicFramePr>
-                        <a:graphicFrameLocks/>
+                        <a:graphicFrameLocks xmlns:a="http://schemas.openxmlformats.org/drawingml/2006/main"/>
                       </wp:cNvGraphicFramePr>
-                      <a:graphic>
+                      <a:graphic xmlns:a="http://schemas.openxmlformats.org/drawingml/2006/main">
                         <a:graphicData uri="http://schemas.microsoft.com/office/word/2010/wordprocessingGroup">
                           <wpg:wgp>
-                            <wpg:cNvPr id="39" name="Group 39"/>
-                            <wpg:cNvGrpSpPr/>
+                            <wpg:cNvGrpSpPr>
+                              <a:grpSpLocks/>
+                            </wpg:cNvGrpSpPr>
                             <wpg:grpSpPr>
                               <a:xfrm>
                                 <a:off x="0" y="0"/>
                                 <a:ext cx="76200" cy="114300"/>
+                                <a:chOff x="0" y="0"/>
                                 <a:chExt cx="76200" cy="114300"/>
                               </a:xfrm>
                             </wpg:grpSpPr>
-                            <pic:pic>
+                            <pic:pic xmlns:pic="http://schemas.openxmlformats.org/drawingml/2006/picture">
                               <pic:nvPicPr>
                                 <pic:cNvPr id="40" name="Image 40"/>
                                 <pic:cNvPicPr/>
                               </pic:nvPicPr>
                               <pic:blipFill>
-                                <a:blip r:embed="rId5" cstate="print"/>
+                                <a:blip r:embed="rId4" cstate="print"/>
                                 <a:stretch>
                                   <a:fillRect/>
                                 </a:stretch>
@@ -4434,11 +4465,10 @@
                 </mc:Choice>
                 <mc:Fallback>
                   <w:pict>
-                    <v:group style="position:absolute;margin-left:6.29pt;margin-top:-7.168016pt;width:6pt;height:9pt;mso-position-horizontal-relative:column;mso-position-vertical-relative:paragraph;z-index:-15831552" id="docshapegroup34" coordorigin="126,-143" coordsize="120,180">
-                      <v:shape style="position:absolute;left:125;top:-144;width:120;height:180" type="#_x0000_t75" id="docshape35" stroked="false">
-                        <v:imagedata r:id="rId5" o:title=""/>
+                    <v:group w14:anchorId="6E824980" id="Group 39" o:spid="_x0000_s1026" style="position:absolute;margin-left:6.3pt;margin-top:-7.15pt;width:6pt;height:9pt;z-index:-15831552;mso-wrap-distance-left:0;mso-wrap-distance-right:0" coordsize="76200,114300" o:gfxdata="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">
+                      <v:shape id="Image 40" o:spid="_x0000_s1027" type="#_x0000_t75" style="position:absolute;width:76198;height:114298;visibility:visible;mso-wrap-style:square" o:gfxdata="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">
+                        <v:imagedata r:id="rId10" o:title=""/>
                       </v:shape>
-                      <w10:wrap type="none"/>
                     </v:group>
                   </w:pict>
                 </mc:Fallback>
@@ -4458,7 +4488,7 @@
                 <w:spacing w:val="-3"/>
                 <w:sz w:val="18"/>
               </w:rPr>
-              <w:t> </w:t>
+              <w:t xml:space="preserve"> </w:t>
             </w:r>
             <w:r>
               <w:rPr>
@@ -4519,7 +4549,7 @@
                 <w:spacing w:val="-13"/>
                 <w:sz w:val="18"/>
               </w:rPr>
-              <w:t> </w:t>
+              <w:t xml:space="preserve"> </w:t>
             </w:r>
             <w:r>
               <w:rPr>
@@ -4533,7 +4563,7 @@
       </w:tr>
       <w:tr>
         <w:trPr>
-          <w:trHeight w:val="1187" w:hRule="atLeast"/>
+          <w:trHeight w:val="1187"/>
         </w:trPr>
         <w:tc>
           <w:tcPr>
@@ -4565,7 +4595,7 @@
                 <w:spacing w:val="40"/>
                 <w:sz w:val="18"/>
               </w:rPr>
-              <w:t> </w:t>
+              <w:t xml:space="preserve"> </w:t>
             </w:r>
             <w:r>
               <w:rPr>
@@ -4581,7 +4611,7 @@
                 <w:spacing w:val="-11"/>
                 <w:sz w:val="18"/>
               </w:rPr>
-              <w:t> </w:t>
+              <w:t xml:space="preserve"> </w:t>
             </w:r>
             <w:r>
               <w:rPr>
@@ -4595,7 +4625,7 @@
           <w:p>
             <w:pPr>
               <w:pStyle w:val="TableParagraph"/>
-              <w:spacing w:line="244" w:lineRule="auto" w:before="154"/>
+              <w:spacing w:before="154" w:line="244" w:lineRule="auto"/>
               <w:ind w:right="2001"/>
               <w:rPr>
                 <w:sz w:val="18"/>
@@ -4607,7 +4637,7 @@
                 <w:spacing w:val="-2"/>
                 <w:sz w:val="18"/>
               </w:rPr>
-              <w:t>Cabin: </w:t>
+              <w:t xml:space="preserve">Cabin: </w:t>
             </w:r>
             <w:r>
               <w:rPr>
@@ -4622,7 +4652,7 @@
                 <w:spacing w:val="-15"/>
                 <w:sz w:val="18"/>
               </w:rPr>
-              <w:t> </w:t>
+              <w:t xml:space="preserve"> </w:t>
             </w:r>
             <w:r>
               <w:rPr>
@@ -4637,7 +4667,7 @@
                 <w:spacing w:val="-12"/>
                 <w:sz w:val="18"/>
               </w:rPr>
-              <w:t> </w:t>
+              <w:t xml:space="preserve"> </w:t>
             </w:r>
             <w:r>
               <w:rPr>
@@ -4678,7 +4708,7 @@
                 <w:spacing w:val="-5"/>
                 <w:sz w:val="18"/>
               </w:rPr>
-              <w:t> At:</w:t>
+              <w:t xml:space="preserve"> At:</w:t>
             </w:r>
           </w:p>
           <w:p>
@@ -4713,7 +4743,7 @@
                 <w:spacing w:val="-2"/>
                 <w:sz w:val="18"/>
               </w:rPr>
-              <w:t>Terminal: </w:t>
+              <w:t xml:space="preserve">Terminal: </w:t>
             </w:r>
             <w:r>
               <w:rPr>
@@ -4728,7 +4758,7 @@
                 <w:spacing w:val="-13"/>
                 <w:sz w:val="18"/>
               </w:rPr>
-              <w:t> </w:t>
+              <w:t xml:space="preserve"> </w:t>
             </w:r>
             <w:r>
               <w:rPr>
@@ -4770,7 +4800,7 @@
                 <w:spacing w:val="-4"/>
                 <w:sz w:val="18"/>
               </w:rPr>
-              <w:t> </w:t>
+              <w:t xml:space="preserve"> </w:t>
             </w:r>
             <w:r>
               <w:rPr>
@@ -4814,7 +4844,7 @@
                 <w:spacing w:val="-2"/>
                 <w:sz w:val="18"/>
               </w:rPr>
-              <w:t>Terminal: </w:t>
+              <w:t xml:space="preserve">Terminal: </w:t>
             </w:r>
             <w:r>
               <w:rPr>
@@ -4829,7 +4859,7 @@
                 <w:spacing w:val="-13"/>
                 <w:sz w:val="18"/>
               </w:rPr>
-              <w:t> </w:t>
+              <w:t xml:space="preserve"> </w:t>
             </w:r>
             <w:r>
               <w:rPr>
@@ -4852,7 +4882,7 @@
             <w:pPr>
               <w:pStyle w:val="TableParagraph"/>
               <w:tabs>
-                <w:tab w:pos="2041" w:val="right" w:leader="none"/>
+                <w:tab w:val="right" w:pos="2041"/>
               </w:tabs>
               <w:spacing w:before="85"/>
               <w:ind w:left="161"/>
@@ -4874,7 +4904,7 @@
                 <w:spacing w:val="-2"/>
                 <w:sz w:val="18"/>
               </w:rPr>
-              <w:t> </w:t>
+              <w:t xml:space="preserve"> </w:t>
             </w:r>
             <w:r>
               <w:rPr>
@@ -4903,7 +4933,7 @@
           <w:p>
             <w:pPr>
               <w:pStyle w:val="TableParagraph"/>
-              <w:spacing w:line="242" w:lineRule="auto" w:before="2"/>
+              <w:spacing w:before="2" w:line="242" w:lineRule="auto"/>
               <w:ind w:left="161" w:right="1752"/>
               <w:jc w:val="both"/>
               <w:rPr>
@@ -4923,7 +4953,7 @@
       </w:tr>
       <w:tr>
         <w:trPr>
-          <w:trHeight w:val="868" w:hRule="atLeast"/>
+          <w:trHeight w:val="868"/>
         </w:trPr>
         <w:tc>
           <w:tcPr>
@@ -4935,7 +4965,7 @@
           <w:p>
             <w:pPr>
               <w:pStyle w:val="TableParagraph"/>
-              <w:spacing w:line="244" w:lineRule="auto" w:before="20"/>
+              <w:spacing w:before="20" w:line="244" w:lineRule="auto"/>
               <w:ind w:right="2001"/>
               <w:rPr>
                 <w:sz w:val="18"/>
@@ -5025,24 +5055,13 @@
     <w:tbl>
       <w:tblPr>
         <w:tblW w:w="0" w:type="auto"/>
-        <w:jc w:val="left"/>
         <w:tblInd w:w="152" w:type="dxa"/>
-        <w:tblBorders>
-          <w:top w:val="none" w:sz="0" w:space="0" w:color="auto"/>
-          <w:left w:val="none" w:sz="0" w:space="0" w:color="auto"/>
-          <w:bottom w:val="none" w:sz="0" w:space="0" w:color="auto"/>
-          <w:right w:val="none" w:sz="0" w:space="0" w:color="auto"/>
-          <w:insideH w:val="none" w:sz="0" w:space="0" w:color="auto"/>
-          <w:insideV w:val="none" w:sz="0" w:space="0" w:color="auto"/>
-        </w:tblBorders>
         <w:tblLayout w:type="fixed"/>
         <w:tblCellMar>
-          <w:top w:w="0" w:type="dxa"/>
           <w:left w:w="0" w:type="dxa"/>
-          <w:bottom w:w="0" w:type="dxa"/>
           <w:right w:w="0" w:type="dxa"/>
         </w:tblCellMar>
-        <w:tblLook w:val="01E0"/>
+        <w:tblLook w:val="01E0" w:firstRow="1" w:lastRow="1" w:firstColumn="1" w:lastColumn="1" w:noHBand="0" w:noVBand="0"/>
       </w:tblPr>
       <w:tblGrid>
         <w:gridCol w:w="5703"/>
@@ -5050,7 +5069,7 @@
       </w:tblGrid>
       <w:tr>
         <w:trPr>
-          <w:trHeight w:val="268" w:hRule="atLeast"/>
+          <w:trHeight w:val="268"/>
         </w:trPr>
         <w:tc>
           <w:tcPr>
@@ -5082,7 +5101,7 @@
                 <w:spacing w:val="-5"/>
                 <w:sz w:val="18"/>
               </w:rPr>
-              <w:t> </w:t>
+              <w:t xml:space="preserve"> </w:t>
             </w:r>
             <w:r>
               <w:rPr>
@@ -5124,7 +5143,7 @@
       </w:tr>
       <w:tr>
         <w:trPr>
-          <w:trHeight w:val="712" w:hRule="atLeast"/>
+          <w:trHeight w:val="712"/>
         </w:trPr>
         <w:tc>
           <w:tcPr>
@@ -5153,7 +5172,7 @@
                 <w:spacing w:val="-6"/>
                 <w:sz w:val="20"/>
               </w:rPr>
-              <w:t> </w:t>
+              <w:t xml:space="preserve"> </w:t>
             </w:r>
             <w:r>
               <w:rPr>
@@ -5166,7 +5185,7 @@
                 <w:spacing w:val="-7"/>
                 <w:sz w:val="20"/>
               </w:rPr>
-              <w:t> </w:t>
+              <w:t xml:space="preserve"> </w:t>
             </w:r>
             <w:r>
               <w:rPr>
@@ -5188,27 +5207,19 @@
             <w:pPr>
               <w:pStyle w:val="TableParagraph"/>
               <w:ind w:left="-4"/>
-              <w:rPr>
-                <w:sz w:val="22"/>
-              </w:rPr>
             </w:pPr>
             <w:r>
-              <w:rPr>
-                <w:sz w:val="22"/>
-              </w:rPr>
               <w:t>Check-In</w:t>
             </w:r>
             <w:r>
               <w:rPr>
                 <w:spacing w:val="-6"/>
-                <w:sz w:val="22"/>
-              </w:rPr>
-              <w:t> </w:t>
+              </w:rPr>
+              <w:t xml:space="preserve"> </w:t>
             </w:r>
             <w:r>
               <w:rPr>
                 <w:spacing w:val="-2"/>
-                <w:sz w:val="22"/>
               </w:rPr>
               <w:t>Required</w:t>
             </w:r>
@@ -5226,12 +5237,13 @@
       </w:pPr>
       <w:r>
         <w:rPr>
+          <w:noProof/>
           <w:sz w:val="10"/>
         </w:rPr>
         <mc:AlternateContent>
-          <mc:Choice Requires="wps">
+          <mc:Choice Requires="wpg">
             <w:drawing>
-              <wp:anchor distT="0" distB="0" distL="0" distR="0" allowOverlap="1" layoutInCell="1" locked="0" behindDoc="1" simplePos="0" relativeHeight="487588864">
+              <wp:anchor distT="0" distB="0" distL="0" distR="0" simplePos="0" relativeHeight="487588864" behindDoc="1" locked="0" layoutInCell="1" allowOverlap="1" wp14:anchorId="1ACFE705" wp14:editId="34DE70E0">
                 <wp:simplePos x="0" y="0"/>
                 <wp:positionH relativeFrom="page">
                   <wp:posOffset>361950</wp:posOffset>
@@ -5244,17 +5256,19 @@
                 <wp:wrapTopAndBottom/>
                 <wp:docPr id="41" name="Group 41"/>
                 <wp:cNvGraphicFramePr>
-                  <a:graphicFrameLocks/>
+                  <a:graphicFrameLocks xmlns:a="http://schemas.openxmlformats.org/drawingml/2006/main"/>
                 </wp:cNvGraphicFramePr>
-                <a:graphic>
+                <a:graphic xmlns:a="http://schemas.openxmlformats.org/drawingml/2006/main">
                   <a:graphicData uri="http://schemas.microsoft.com/office/word/2010/wordprocessingGroup">
                     <wpg:wgp>
-                      <wpg:cNvPr id="41" name="Group 41"/>
-                      <wpg:cNvGrpSpPr/>
+                      <wpg:cNvGrpSpPr>
+                        <a:grpSpLocks/>
+                      </wpg:cNvGrpSpPr>
                       <wpg:grpSpPr>
                         <a:xfrm>
                           <a:off x="0" y="0"/>
                           <a:ext cx="6837045" cy="981075"/>
+                          <a:chOff x="0" y="0"/>
                           <a:chExt cx="6837045" cy="981075"/>
                         </a:xfrm>
                       </wpg:grpSpPr>
@@ -5384,7 +5398,7 @@
                           <w:txbxContent>
                             <w:p>
                               <w:pPr>
-                                <w:spacing w:line="240" w:lineRule="auto" w:before="194"/>
+                                <w:spacing w:before="194"/>
                                 <w:rPr>
                                   <w:sz w:val="18"/>
                                 </w:rPr>
@@ -5392,9 +5406,7 @@
                             </w:p>
                             <w:p>
                               <w:pPr>
-                                <w:spacing w:before="0"/>
-                                <w:ind w:left="152" w:right="8643" w:firstLine="0"/>
-                                <w:jc w:val="left"/>
+                                <w:ind w:left="152" w:right="8643"/>
                                 <w:rPr>
                                   <w:sz w:val="18"/>
                                 </w:rPr>
@@ -5412,14 +5424,14 @@
                                   <w:spacing w:val="-13"/>
                                   <w:sz w:val="18"/>
                                 </w:rPr>
-                                <w:t> </w:t>
-                              </w:r>
-                              <w:r>
-                                <w:rPr>
-                                  <w:color w:val="333333"/>
-                                  <w:sz w:val="18"/>
-                                </w:rPr>
-                                <w:t>CONSULTANT </w:t>
+                                <w:t xml:space="preserve"> </w:t>
+                              </w:r>
+                              <w:r>
+                                <w:rPr>
+                                  <w:color w:val="333333"/>
+                                  <w:sz w:val="18"/>
+                                </w:rPr>
+                                <w:t xml:space="preserve">CONSULTANT </w:t>
                               </w:r>
                               <w:r>
                                 <w:rPr>
@@ -5444,20 +5456,19 @@
           </mc:Choice>
           <mc:Fallback>
             <w:pict>
-              <v:group style="position:absolute;margin-left:28.5pt;margin-top:7.5pt;width:538.35pt;height:77.25pt;mso-position-horizontal-relative:page;mso-position-vertical-relative:paragraph;z-index:-15727616;mso-wrap-distance-left:0;mso-wrap-distance-right:0" id="docshapegroup36" coordorigin="570,150" coordsize="10767,1545">
-                <v:rect style="position:absolute;left:570;top:150;width:10755;height:1545" id="docshape37" filled="true" fillcolor="#eeeeee" stroked="false">
-                  <v:fill type="solid"/>
-                </v:rect>
-                <v:shape style="position:absolute;left:570;top:150;width:10755;height:45" id="docshape38" coordorigin="570,150" coordsize="10755,45" path="m11325,180l570,180,570,195,11325,195,11325,180xm11325,150l570,150,570,165,11325,165,11325,150xe" filled="true" fillcolor="#000000" stroked="false">
+              <v:group w14:anchorId="1ACFE705" id="Group 41" o:spid="_x0000_s1060" style="position:absolute;margin-left:28.5pt;margin-top:7.5pt;width:538.35pt;height:77.25pt;z-index:-15727616;mso-wrap-distance-left:0;mso-wrap-distance-right:0;mso-position-horizontal-relative:page" coordsize="68370,9810" o:gfxdata="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">
+                <v:shape id="Graphic 42" o:spid="_x0000_s1061" style="position:absolute;width:68294;height:9810;visibility:visible;mso-wrap-style:square;v-text-anchor:top" coordsize="6829425,981075" o:gfxdata="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" path="m6829425,l,,,981074r6829425,l6829425,xe" fillcolor="#eee" stroked="f">
                   <v:path arrowok="t"/>
-                  <v:fill type="solid"/>
                 </v:shape>
-                <v:shape style="position:absolute;left:570;top:180;width:10767;height:1515" type="#_x0000_t202" id="docshape39" filled="false" stroked="false">
+                <v:shape id="Graphic 43" o:spid="_x0000_s1062" style="position:absolute;width:68294;height:285;visibility:visible;mso-wrap-style:square;v-text-anchor:top" coordsize="6829425,28575" o:gfxdata="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" path="m6829425,19050l,19050r,9525l6829425,28575r,-9525xem6829425,l,,,9525r6829425,l6829425,xe" fillcolor="black" stroked="f">
+                  <v:path arrowok="t"/>
+                </v:shape>
+                <v:shape id="Textbox 44" o:spid="_x0000_s1063" type="#_x0000_t202" style="position:absolute;top:190;width:68370;height:9620;visibility:visible;mso-wrap-style:square;v-text-anchor:top" o:gfxdata="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" filled="f" stroked="f">
                   <v:textbox inset="0,0,0,0">
                     <w:txbxContent>
                       <w:p>
                         <w:pPr>
-                          <w:spacing w:line="240" w:lineRule="auto" w:before="194"/>
+                          <w:spacing w:before="194"/>
                           <w:rPr>
                             <w:sz w:val="18"/>
                           </w:rPr>
@@ -5465,9 +5476,7 @@
                       </w:p>
                       <w:p>
                         <w:pPr>
-                          <w:spacing w:before="0"/>
-                          <w:ind w:left="152" w:right="8643" w:firstLine="0"/>
-                          <w:jc w:val="left"/>
+                          <w:ind w:left="152" w:right="8643"/>
                           <w:rPr>
                             <w:sz w:val="18"/>
                           </w:rPr>
@@ -5485,14 +5494,14 @@
                             <w:spacing w:val="-13"/>
                             <w:sz w:val="18"/>
                           </w:rPr>
-                          <w:t> </w:t>
-                        </w:r>
-                        <w:r>
-                          <w:rPr>
-                            <w:color w:val="333333"/>
-                            <w:sz w:val="18"/>
-                          </w:rPr>
-                          <w:t>CONSULTANT </w:t>
+                          <w:t xml:space="preserve"> </w:t>
+                        </w:r>
+                        <w:r>
+                          <w:rPr>
+                            <w:color w:val="333333"/>
+                            <w:sz w:val="18"/>
+                          </w:rPr>
+                          <w:t xml:space="preserve">CONSULTANT </w:t>
                         </w:r>
                         <w:r>
                           <w:rPr>
@@ -5505,9 +5514,8 @@
                       </w:p>
                     </w:txbxContent>
                   </v:textbox>
-                  <w10:wrap type="none"/>
                 </v:shape>
-                <w10:wrap type="topAndBottom"/>
+                <w10:wrap type="topAndBottom" anchorx="page"/>
               </v:group>
             </w:pict>
           </mc:Fallback>
@@ -5531,7 +5539,7 @@
           <w:color w:val="333333"/>
           <w:spacing w:val="-13"/>
         </w:rPr>
-        <w:t> </w:t>
+        <w:t xml:space="preserve"> </w:t>
       </w:r>
       <w:r>
         <w:rPr>
@@ -5544,7 +5552,7 @@
           <w:color w:val="333333"/>
           <w:spacing w:val="-11"/>
         </w:rPr>
-        <w:t> </w:t>
+        <w:t xml:space="preserve"> </w:t>
       </w:r>
       <w:r>
         <w:rPr>
@@ -5557,7 +5565,7 @@
           <w:color w:val="333333"/>
           <w:spacing w:val="-12"/>
         </w:rPr>
-        <w:t> </w:t>
+        <w:t xml:space="preserve"> </w:t>
       </w:r>
       <w:r>
         <w:rPr>
@@ -5570,7 +5578,7 @@
           <w:color w:val="333333"/>
           <w:spacing w:val="-12"/>
         </w:rPr>
-        <w:t> </w:t>
+        <w:t xml:space="preserve"> </w:t>
       </w:r>
       <w:r>
         <w:rPr>
@@ -5583,7 +5591,7 @@
           <w:color w:val="333333"/>
           <w:spacing w:val="-14"/>
         </w:rPr>
-        <w:t> </w:t>
+        <w:t xml:space="preserve"> </w:t>
       </w:r>
       <w:r>
         <w:rPr>
@@ -5596,11 +5604,11 @@
     <w:p>
       <w:pPr>
         <w:pStyle w:val="BodyText"/>
-        <w:spacing w:after="0"/>
         <w:sectPr>
           <w:type w:val="continuous"/>
           <w:pgSz w:w="11900" w:h="16850"/>
-          <w:pgMar w:top="520" w:bottom="280" w:left="425" w:right="425"/>
+          <w:pgMar w:top="520" w:right="425" w:bottom="280" w:left="425" w:header="720" w:footer="720" w:gutter="0"/>
+          <w:cols w:space="720"/>
         </w:sectPr>
       </w:pPr>
     </w:p>
@@ -5615,21 +5623,22 @@
     </w:p>
     <w:sectPr>
       <w:pgSz w:w="12000" w:h="16970"/>
-      <w:pgMar w:top="1960" w:bottom="280" w:left="1700" w:right="1700"/>
+      <w:pgMar w:top="1960" w:right="1700" w:bottom="280" w:left="1700" w:header="720" w:footer="720" w:gutter="0"/>
+      <w:cols w:space="720"/>
     </w:sectPr>
   </w:body>
 </w:document>
 </file>
 
 <file path=word/styles.xml><?xml version="1.0" encoding="utf-8"?>
-<w:styles xmlns:r="http://schemas.openxmlformats.org/officeDocument/2006/relationships" xmlns:w="http://schemas.openxmlformats.org/wordprocessingml/2006/main">
+<w:styles xmlns:mc="http://schemas.openxmlformats.org/markup-compatibility/2006" xmlns:r="http://schemas.openxmlformats.org/officeDocument/2006/relationships" xmlns:w="http://schemas.openxmlformats.org/wordprocessingml/2006/main" xmlns:w14="http://schemas.microsoft.com/office/word/2010/wordml" xmlns:w15="http://schemas.microsoft.com/office/word/2012/wordml" xmlns:w16cex="http://schemas.microsoft.com/office/word/2018/wordml/cex" xmlns:w16cid="http://schemas.microsoft.com/office/word/2016/wordml/cid" xmlns:w16="http://schemas.microsoft.com/office/word/2018/wordml" xmlns:w16du="http://schemas.microsoft.com/office/word/2023/wordml/word16du" xmlns:w16sdtdh="http://schemas.microsoft.com/office/word/2020/wordml/sdtdatahash" xmlns:w16sdtfl="http://schemas.microsoft.com/office/word/2024/wordml/sdtformatlock" xmlns:w16se="http://schemas.microsoft.com/office/word/2015/wordml/symex" mc:Ignorable="w14 w15 w16se w16cid w16 w16cex w16sdtdh w16sdtfl w16du">
   <w:docDefaults>
     <w:rPrDefault>
       <w:rPr>
-        <w:rFonts w:cstheme="minorBidi" w:hAnsiTheme="minorHAnsi" w:eastAsiaTheme="minorHAnsi" w:asciiTheme="minorHAnsi"/>
+        <w:rFonts w:asciiTheme="minorHAnsi" w:eastAsiaTheme="minorHAnsi" w:hAnsiTheme="minorHAnsi" w:cstheme="minorBidi"/>
         <w:sz w:val="22"/>
         <w:szCs w:val="22"/>
-        <w:lang w:val="en-US" w:bidi="ar-SA" w:eastAsia="en-US"/>
+        <w:lang w:val="en-US" w:eastAsia="en-US" w:bidi="ar-SA"/>
       </w:rPr>
     </w:rPrDefault>
     <w:pPrDefault>
@@ -5637,92 +5646,454 @@
         <w:widowControl w:val="0"/>
         <w:autoSpaceDE w:val="0"/>
         <w:autoSpaceDN w:val="0"/>
-        <w:spacing w:lineRule="auto" w:line="240" w:before="0" w:after="0"/>
-        <w:ind w:left="0" w:right="0"/>
-        <w:jc w:val="left"/>
       </w:pPr>
     </w:pPrDefault>
   </w:docDefaults>
-  <w:style w:styleId="DefaultParagraphFont" w:default="1" w:type="character">
+  <w:latentStyles w:defLockedState="0" w:defUIPriority="99" w:defSemiHidden="0" w:defUnhideWhenUsed="0" w:defQFormat="0" w:count="376">
+    <w:lsdException w:name="Normal" w:uiPriority="0" w:qFormat="1"/>
+    <w:lsdException w:name="heading 1" w:uiPriority="9" w:qFormat="1"/>
+    <w:lsdException w:name="heading 2" w:semiHidden="1" w:uiPriority="9" w:unhideWhenUsed="1" w:qFormat="1"/>
+    <w:lsdException w:name="heading 3" w:semiHidden="1" w:uiPriority="9" w:unhideWhenUsed="1" w:qFormat="1"/>
+    <w:lsdException w:name="heading 4" w:semiHidden="1" w:uiPriority="9" w:unhideWhenUsed="1" w:qFormat="1"/>
+    <w:lsdException w:name="heading 5" w:semiHidden="1" w:uiPriority="9" w:unhideWhenUsed="1" w:qFormat="1"/>
+    <w:lsdException w:name="heading 6" w:semiHidden="1" w:uiPriority="9" w:unhideWhenUsed="1" w:qFormat="1"/>
+    <w:lsdException w:name="heading 7" w:semiHidden="1" w:uiPriority="9" w:unhideWhenUsed="1" w:qFormat="1"/>
+    <w:lsdException w:name="heading 8" w:semiHidden="1" w:uiPriority="9" w:unhideWhenUsed="1" w:qFormat="1"/>
+    <w:lsdException w:name="heading 9" w:semiHidden="1" w:uiPriority="9" w:unhideWhenUsed="1" w:qFormat="1"/>
+    <w:lsdException w:name="index 1" w:semiHidden="1" w:unhideWhenUsed="1"/>
+    <w:lsdException w:name="index 2" w:semiHidden="1" w:unhideWhenUsed="1"/>
+    <w:lsdException w:name="index 3" w:semiHidden="1" w:unhideWhenUsed="1"/>
+    <w:lsdException w:name="index 4" w:semiHidden="1" w:unhideWhenUsed="1"/>
+    <w:lsdException w:name="index 5" w:semiHidden="1" w:unhideWhenUsed="1"/>
+    <w:lsdException w:name="index 6" w:semiHidden="1" w:unhideWhenUsed="1"/>
+    <w:lsdException w:name="index 7" w:semiHidden="1" w:unhideWhenUsed="1"/>
+    <w:lsdException w:name="index 8" w:semiHidden="1" w:unhideWhenUsed="1"/>
+    <w:lsdException w:name="index 9" w:semiHidden="1" w:unhideWhenUsed="1"/>
+    <w:lsdException w:name="toc 1" w:semiHidden="1" w:uiPriority="39" w:unhideWhenUsed="1"/>
+    <w:lsdException w:name="toc 2" w:semiHidden="1" w:uiPriority="39" w:unhideWhenUsed="1"/>
+    <w:lsdException w:name="toc 3" w:semiHidden="1" w:uiPriority="39" w:unhideWhenUsed="1"/>
+    <w:lsdException w:name="toc 4" w:semiHidden="1" w:uiPriority="39" w:unhideWhenUsed="1"/>
+    <w:lsdException w:name="toc 5" w:semiHidden="1" w:uiPriority="39" w:unhideWhenUsed="1"/>
+    <w:lsdException w:name="toc 6" w:semiHidden="1" w:uiPriority="39" w:unhideWhenUsed="1"/>
+    <w:lsdException w:name="toc 7" w:semiHidden="1" w:uiPriority="39" w:unhideWhenUsed="1"/>
+    <w:lsdException w:name="toc 8" w:semiHidden="1" w:uiPriority="39" w:unhideWhenUsed="1"/>
+    <w:lsdException w:name="toc 9" w:semiHidden="1" w:uiPriority="39" w:unhideWhenUsed="1"/>
+    <w:lsdException w:name="Normal Indent" w:semiHidden="1" w:unhideWhenUsed="1"/>
+    <w:lsdException w:name="footnote text" w:semiHidden="1" w:unhideWhenUsed="1"/>
+    <w:lsdException w:name="annotation text" w:semiHidden="1" w:unhideWhenUsed="1"/>
+    <w:lsdException w:name="header" w:semiHidden="1" w:unhideWhenUsed="1"/>
+    <w:lsdException w:name="footer" w:semiHidden="1" w:unhideWhenUsed="1"/>
+    <w:lsdException w:name="index heading" w:semiHidden="1" w:unhideWhenUsed="1"/>
+    <w:lsdException w:name="caption" w:semiHidden="1" w:uiPriority="35" w:unhideWhenUsed="1" w:qFormat="1"/>
+    <w:lsdException w:name="table of figures" w:semiHidden="1" w:unhideWhenUsed="1"/>
+    <w:lsdException w:name="envelope address" w:semiHidden="1" w:unhideWhenUsed="1"/>
+    <w:lsdException w:name="envelope return" w:semiHidden="1" w:unhideWhenUsed="1"/>
+    <w:lsdException w:name="footnote reference" w:semiHidden="1" w:unhideWhenUsed="1"/>
+    <w:lsdException w:name="annotation reference" w:semiHidden="1" w:unhideWhenUsed="1"/>
+    <w:lsdException w:name="line number" w:semiHidden="1" w:unhideWhenUsed="1"/>
+    <w:lsdException w:name="page number" w:semiHidden="1" w:unhideWhenUsed="1"/>
+    <w:lsdException w:name="endnote reference" w:semiHidden="1" w:unhideWhenUsed="1"/>
+    <w:lsdException w:name="endnote text" w:semiHidden="1" w:unhideWhenUsed="1"/>
+    <w:lsdException w:name="table of authorities" w:semiHidden="1" w:unhideWhenUsed="1"/>
+    <w:lsdException w:name="macro" w:semiHidden="1" w:unhideWhenUsed="1"/>
+    <w:lsdException w:name="toa heading" w:semiHidden="1" w:unhideWhenUsed="1"/>
+    <w:lsdException w:name="List" w:semiHidden="1" w:unhideWhenUsed="1"/>
+    <w:lsdException w:name="List Bullet" w:semiHidden="1" w:unhideWhenUsed="1"/>
+    <w:lsdException w:name="List Number" w:semiHidden="1" w:unhideWhenUsed="1"/>
+    <w:lsdException w:name="List 2" w:semiHidden="1" w:unhideWhenUsed="1"/>
+    <w:lsdException w:name="List 3" w:semiHidden="1" w:unhideWhenUsed="1"/>
+    <w:lsdException w:name="List 4" w:semiHidden="1" w:unhideWhenUsed="1"/>
+    <w:lsdException w:name="List 5" w:semiHidden="1" w:unhideWhenUsed="1"/>
+    <w:lsdException w:name="List Bullet 2" w:semiHidden="1" w:unhideWhenUsed="1"/>
+    <w:lsdException w:name="List Bullet 3" w:semiHidden="1" w:unhideWhenUsed="1"/>
+    <w:lsdException w:name="List Bullet 4" w:semiHidden="1" w:unhideWhenUsed="1"/>
+    <w:lsdException w:name="List Bullet 5" w:semiHidden="1" w:unhideWhenUsed="1"/>
+    <w:lsdException w:name="List Number 2" w:semiHidden="1" w:unhideWhenUsed="1"/>
+    <w:lsdException w:name="List Number 3" w:semiHidden="1" w:unhideWhenUsed="1"/>
+    <w:lsdException w:name="List Number 4" w:semiHidden="1" w:unhideWhenUsed="1"/>
+    <w:lsdException w:name="List Number 5" w:semiHidden="1" w:unhideWhenUsed="1"/>
+    <w:lsdException w:name="Title" w:uiPriority="10" w:qFormat="1"/>
+    <w:lsdException w:name="Closing" w:semiHidden="1" w:unhideWhenUsed="1"/>
+    <w:lsdException w:name="Signature" w:semiHidden="1" w:unhideWhenUsed="1"/>
+    <w:lsdException w:name="Default Paragraph Font" w:semiHidden="1" w:uiPriority="1" w:unhideWhenUsed="1"/>
+    <w:lsdException w:name="Body Text" w:semiHidden="1" w:unhideWhenUsed="1"/>
+    <w:lsdException w:name="Body Text Indent" w:semiHidden="1" w:unhideWhenUsed="1"/>
+    <w:lsdException w:name="List Continue" w:semiHidden="1" w:unhideWhenUsed="1"/>
+    <w:lsdException w:name="List Continue 2" w:semiHidden="1" w:unhideWhenUsed="1"/>
+    <w:lsdException w:name="List Continue 3" w:semiHidden="1" w:unhideWhenUsed="1"/>
+    <w:lsdException w:name="List Continue 4" w:semiHidden="1" w:unhideWhenUsed="1"/>
+    <w:lsdException w:name="List Continue 5" w:semiHidden="1" w:unhideWhenUsed="1"/>
+    <w:lsdException w:name="Message Header" w:semiHidden="1" w:unhideWhenUsed="1"/>
+    <w:lsdException w:name="Subtitle" w:uiPriority="11" w:qFormat="1"/>
+    <w:lsdException w:name="Salutation" w:semiHidden="1" w:unhideWhenUsed="1"/>
+    <w:lsdException w:name="Date" w:semiHidden="1" w:unhideWhenUsed="1"/>
+    <w:lsdException w:name="Body Text First Indent" w:semiHidden="1" w:unhideWhenUsed="1"/>
+    <w:lsdException w:name="Body Text First Indent 2" w:semiHidden="1" w:unhideWhenUsed="1"/>
+    <w:lsdException w:name="Note Heading" w:semiHidden="1" w:unhideWhenUsed="1"/>
+    <w:lsdException w:name="Body Text 2" w:semiHidden="1" w:unhideWhenUsed="1"/>
+    <w:lsdException w:name="Body Text 3" w:semiHidden="1" w:unhideWhenUsed="1"/>
+    <w:lsdException w:name="Body Text Indent 2" w:semiHidden="1" w:unhideWhenUsed="1"/>
+    <w:lsdException w:name="Body Text Indent 3" w:semiHidden="1" w:unhideWhenUsed="1"/>
+    <w:lsdException w:name="Block Text" w:semiHidden="1" w:unhideWhenUsed="1"/>
+    <w:lsdException w:name="Hyperlink" w:semiHidden="1" w:unhideWhenUsed="1"/>
+    <w:lsdException w:name="FollowedHyperlink" w:semiHidden="1" w:unhideWhenUsed="1"/>
+    <w:lsdException w:name="Strong" w:uiPriority="22" w:qFormat="1"/>
+    <w:lsdException w:name="Emphasis" w:uiPriority="20" w:qFormat="1"/>
+    <w:lsdException w:name="Document Map" w:semiHidden="1" w:unhideWhenUsed="1"/>
+    <w:lsdException w:name="Plain Text" w:semiHidden="1" w:unhideWhenUsed="1"/>
+    <w:lsdException w:name="E-mail Signature" w:semiHidden="1" w:unhideWhenUsed="1"/>
+    <w:lsdException w:name="HTML Top of Form" w:semiHidden="1" w:unhideWhenUsed="1"/>
+    <w:lsdException w:name="HTML Bottom of Form" w:semiHidden="1" w:unhideWhenUsed="1"/>
+    <w:lsdException w:name="Normal (Web)" w:semiHidden="1" w:unhideWhenUsed="1"/>
+    <w:lsdException w:name="HTML Acronym" w:semiHidden="1" w:unhideWhenUsed="1"/>
+    <w:lsdException w:name="HTML Address" w:semiHidden="1" w:unhideWhenUsed="1"/>
+    <w:lsdException w:name="HTML Cite" w:semiHidden="1" w:unhideWhenUsed="1"/>
+    <w:lsdException w:name="HTML Code" w:semiHidden="1" w:unhideWhenUsed="1"/>
+    <w:lsdException w:name="HTML Definition" w:semiHidden="1" w:unhideWhenUsed="1"/>
+    <w:lsdException w:name="HTML Keyboard" w:semiHidden="1" w:unhideWhenUsed="1"/>
+    <w:lsdException w:name="HTML Preformatted" w:semiHidden="1" w:unhideWhenUsed="1"/>
+    <w:lsdException w:name="HTML Sample" w:semiHidden="1" w:unhideWhenUsed="1"/>
+    <w:lsdException w:name="HTML Typewriter" w:semiHidden="1" w:unhideWhenUsed="1"/>
+    <w:lsdException w:name="HTML Variable" w:semiHidden="1" w:unhideWhenUsed="1"/>
+    <w:lsdException w:name="Normal Table" w:semiHidden="1" w:unhideWhenUsed="1"/>
+    <w:lsdException w:name="annotation subject" w:semiHidden="1" w:unhideWhenUsed="1"/>
+    <w:lsdException w:name="No List" w:semiHidden="1" w:unhideWhenUsed="1"/>
+    <w:lsdException w:name="Outline List 1" w:semiHidden="1" w:unhideWhenUsed="1"/>
+    <w:lsdException w:name="Outline List 2" w:semiHidden="1" w:unhideWhenUsed="1"/>
+    <w:lsdException w:name="Outline List 3" w:semiHidden="1" w:unhideWhenUsed="1"/>
+    <w:lsdException w:name="Table Simple 1" w:semiHidden="1" w:unhideWhenUsed="1"/>
+    <w:lsdException w:name="Table Simple 2" w:semiHidden="1" w:unhideWhenUsed="1"/>
+    <w:lsdException w:name="Table Simple 3" w:semiHidden="1" w:unhideWhenUsed="1"/>
+    <w:lsdException w:name="Table Classic 1" w:semiHidden="1" w:unhideWhenUsed="1"/>
+    <w:lsdException w:name="Table Classic 2" w:semiHidden="1" w:unhideWhenUsed="1"/>
+    <w:lsdException w:name="Table Classic 3" w:semiHidden="1" w:unhideWhenUsed="1"/>
+    <w:lsdException w:name="Table Classic 4" w:semiHidden="1" w:unhideWhenUsed="1"/>
+    <w:lsdException w:name="Table Colorful 1" w:semiHidden="1" w:unhideWhenUsed="1"/>
+    <w:lsdException w:name="Table Colorful 2" w:semiHidden="1" w:unhideWhenUsed="1"/>
+    <w:lsdException w:name="Table Colorful 3" w:semiHidden="1" w:unhideWhenUsed="1"/>
+    <w:lsdException w:name="Table Columns 1" w:semiHidden="1" w:unhideWhenUsed="1"/>
+    <w:lsdException w:name="Table Columns 2" w:semiHidden="1" w:unhideWhenUsed="1"/>
+    <w:lsdException w:name="Table Columns 3" w:semiHidden="1" w:unhideWhenUsed="1"/>
+    <w:lsdException w:name="Table Columns 4" w:semiHidden="1" w:unhideWhenUsed="1"/>
+    <w:lsdException w:name="Table Columns 5" w:semiHidden="1" w:unhideWhenUsed="1"/>
+    <w:lsdException w:name="Table Grid 1" w:semiHidden="1" w:unhideWhenUsed="1"/>
+    <w:lsdException w:name="Table Grid 2" w:semiHidden="1" w:unhideWhenUsed="1"/>
+    <w:lsdException w:name="Table Grid 3" w:semiHidden="1" w:unhideWhenUsed="1"/>
+    <w:lsdException w:name="Table Grid 4" w:semiHidden="1" w:unhideWhenUsed="1"/>
+    <w:lsdException w:name="Table Grid 5" w:semiHidden="1" w:unhideWhenUsed="1"/>
+    <w:lsdException w:name="Table Grid 6" w:semiHidden="1" w:unhideWhenUsed="1"/>
+    <w:lsdException w:name="Table Grid 7" w:semiHidden="1" w:unhideWhenUsed="1"/>
+    <w:lsdException w:name="Table Grid 8" w:semiHidden="1" w:unhideWhenUsed="1"/>
+    <w:lsdException w:name="Table List 1" w:semiHidden="1" w:unhideWhenUsed="1"/>
+    <w:lsdException w:name="Table List 2" w:semiHidden="1" w:unhideWhenUsed="1"/>
+    <w:lsdException w:name="Table List 3" w:semiHidden="1" w:unhideWhenUsed="1"/>
+    <w:lsdException w:name="Table List 4" w:semiHidden="1" w:unhideWhenUsed="1"/>
+    <w:lsdException w:name="Table List 5" w:semiHidden="1" w:unhideWhenUsed="1"/>
+    <w:lsdException w:name="Table List 6" w:semiHidden="1" w:unhideWhenUsed="1"/>
+    <w:lsdException w:name="Table List 7" w:semiHidden="1" w:unhideWhenUsed="1"/>
+    <w:lsdException w:name="Table List 8" w:semiHidden="1" w:unhideWhenUsed="1"/>
+    <w:lsdException w:name="Table 3D effects 1" w:semiHidden="1" w:unhideWhenUsed="1"/>
+    <w:lsdException w:name="Table 3D effects 2" w:semiHidden="1" w:unhideWhenUsed="1"/>
+    <w:lsdException w:name="Table 3D effects 3" w:semiHidden="1" w:unhideWhenUsed="1"/>
+    <w:lsdException w:name="Table Contemporary" w:semiHidden="1" w:unhideWhenUsed="1"/>
+    <w:lsdException w:name="Table Elegant" w:semiHidden="1" w:unhideWhenUsed="1"/>
+    <w:lsdException w:name="Table Professional" w:semiHidden="1" w:unhideWhenUsed="1"/>
+    <w:lsdException w:name="Table Subtle 1" w:semiHidden="1" w:unhideWhenUsed="1"/>
+    <w:lsdException w:name="Table Subtle 2" w:semiHidden="1" w:unhideWhenUsed="1"/>
+    <w:lsdException w:name="Table Web 1" w:semiHidden="1" w:unhideWhenUsed="1"/>
+    <w:lsdException w:name="Table Web 2" w:semiHidden="1" w:unhideWhenUsed="1"/>
+    <w:lsdException w:name="Table Web 3" w:semiHidden="1" w:unhideWhenUsed="1"/>
+    <w:lsdException w:name="Balloon Text" w:semiHidden="1" w:unhideWhenUsed="1"/>
+    <w:lsdException w:name="Table Grid" w:uiPriority="39"/>
+    <w:lsdException w:name="Table Theme" w:semiHidden="1" w:unhideWhenUsed="1"/>
+    <w:lsdException w:name="Placeholder Text" w:semiHidden="1"/>
+    <w:lsdException w:name="No Spacing" w:uiPriority="1" w:qFormat="1"/>
+    <w:lsdException w:name="Light Shading" w:uiPriority="60"/>
+    <w:lsdException w:name="Light List" w:uiPriority="61"/>
+    <w:lsdException w:name="Light Grid" w:uiPriority="62"/>
+    <w:lsdException w:name="Medium Shading 1" w:uiPriority="63"/>
+    <w:lsdException w:name="Medium Shading 2" w:uiPriority="64"/>
+    <w:lsdException w:name="Medium List 1" w:uiPriority="65"/>
+    <w:lsdException w:name="Medium List 2" w:uiPriority="66"/>
+    <w:lsdException w:name="Medium Grid 1" w:uiPriority="67"/>
+    <w:lsdException w:name="Medium Grid 2" w:uiPriority="68"/>
+    <w:lsdException w:name="Medium Grid 3" w:uiPriority="69"/>
+    <w:lsdException w:name="Dark List" w:uiPriority="70"/>
+    <w:lsdException w:name="Colorful Shading" w:uiPriority="71"/>
+    <w:lsdException w:name="Colorful List" w:uiPriority="72"/>
+    <w:lsdException w:name="Colorful Grid" w:uiPriority="73"/>
+    <w:lsdException w:name="Light Shading Accent 1" w:uiPriority="60"/>
+    <w:lsdException w:name="Light List Accent 1" w:uiPriority="61"/>
+    <w:lsdException w:name="Light Grid Accent 1" w:uiPriority="62"/>
+    <w:lsdException w:name="Medium Shading 1 Accent 1" w:uiPriority="63"/>
+    <w:lsdException w:name="Medium Shading 2 Accent 1" w:uiPriority="64"/>
+    <w:lsdException w:name="Medium List 1 Accent 1" w:uiPriority="65"/>
+    <w:lsdException w:name="Revision" w:semiHidden="1"/>
+    <w:lsdException w:name="List Paragraph" w:uiPriority="34" w:qFormat="1"/>
+    <w:lsdException w:name="Quote" w:uiPriority="29" w:qFormat="1"/>
+    <w:lsdException w:name="Intense Quote" w:uiPriority="30" w:qFormat="1"/>
+    <w:lsdException w:name="Medium List 2 Accent 1" w:uiPriority="66"/>
+    <w:lsdException w:name="Medium Grid 1 Accent 1" w:uiPriority="67"/>
+    <w:lsdException w:name="Medium Grid 2 Accent 1" w:uiPriority="68"/>
+    <w:lsdException w:name="Medium Grid 3 Accent 1" w:uiPriority="69"/>
+    <w:lsdException w:name="Dark List Accent 1" w:uiPriority="70"/>
+    <w:lsdException w:name="Colorful Shading Accent 1" w:uiPriority="71"/>
+    <w:lsdException w:name="Colorful List Accent 1" w:uiPriority="72"/>
+    <w:lsdException w:name="Colorful Grid Accent 1" w:uiPriority="73"/>
+    <w:lsdException w:name="Light Shading Accent 2" w:uiPriority="60"/>
+    <w:lsdException w:name="Light List Accent 2" w:uiPriority="61"/>
+    <w:lsdException w:name="Light Grid Accent 2" w:uiPriority="62"/>
+    <w:lsdException w:name="Medium Shading 1 Accent 2" w:uiPriority="63"/>
+    <w:lsdException w:name="Medium Shading 2 Accent 2" w:uiPriority="64"/>
+    <w:lsdException w:name="Medium List 1 Accent 2" w:uiPriority="65"/>
+    <w:lsdException w:name="Medium List 2 Accent 2" w:uiPriority="66"/>
+    <w:lsdException w:name="Medium Grid 1 Accent 2" w:uiPriority="67"/>
+    <w:lsdException w:name="Medium Grid 2 Accent 2" w:uiPriority="68"/>
+    <w:lsdException w:name="Medium Grid 3 Accent 2" w:uiPriority="69"/>
+    <w:lsdException w:name="Dark List Accent 2" w:uiPriority="70"/>
+    <w:lsdException w:name="Colorful Shading Accent 2" w:uiPriority="71"/>
+    <w:lsdException w:name="Colorful List Accent 2" w:uiPriority="72"/>
+    <w:lsdException w:name="Colorful Grid Accent 2" w:uiPriority="73"/>
+    <w:lsdException w:name="Light Shading Accent 3" w:uiPriority="60"/>
+    <w:lsdException w:name="Light List Accent 3" w:uiPriority="61"/>
+    <w:lsdException w:name="Light Grid Accent 3" w:uiPriority="62"/>
+    <w:lsdException w:name="Medium Shading 1 Accent 3" w:uiPriority="63"/>
+    <w:lsdException w:name="Medium Shading 2 Accent 3" w:uiPriority="64"/>
+    <w:lsdException w:name="Medium List 1 Accent 3" w:uiPriority="65"/>
+    <w:lsdException w:name="Medium List 2 Accent 3" w:uiPriority="66"/>
+    <w:lsdException w:name="Medium Grid 1 Accent 3" w:uiPriority="67"/>
+    <w:lsdException w:name="Medium Grid 2 Accent 3" w:uiPriority="68"/>
+    <w:lsdException w:name="Medium Grid 3 Accent 3" w:uiPriority="69"/>
+    <w:lsdException w:name="Dark List Accent 3" w:uiPriority="70"/>
+    <w:lsdException w:name="Colorful Shading Accent 3" w:uiPriority="71"/>
+    <w:lsdException w:name="Colorful List Accent 3" w:uiPriority="72"/>
+    <w:lsdException w:name="Colorful Grid Accent 3" w:uiPriority="73"/>
+    <w:lsdException w:name="Light Shading Accent 4" w:uiPriority="60"/>
+    <w:lsdException w:name="Light List Accent 4" w:uiPriority="61"/>
+    <w:lsdException w:name="Light Grid Accent 4" w:uiPriority="62"/>
+    <w:lsdException w:name="Medium Shading 1 Accent 4" w:uiPriority="63"/>
+    <w:lsdException w:name="Medium Shading 2 Accent 4" w:uiPriority="64"/>
+    <w:lsdException w:name="Medium List 1 Accent 4" w:uiPriority="65"/>
+    <w:lsdException w:name="Medium List 2 Accent 4" w:uiPriority="66"/>
+    <w:lsdException w:name="Medium Grid 1 Accent 4" w:uiPriority="67"/>
+    <w:lsdException w:name="Medium Grid 2 Accent 4" w:uiPriority="68"/>
+    <w:lsdException w:name="Medium Grid 3 Accent 4" w:uiPriority="69"/>
+    <w:lsdException w:name="Dark List Accent 4" w:uiPriority="70"/>
+    <w:lsdException w:name="Colorful Shading Accent 4" w:uiPriority="71"/>
+    <w:lsdException w:name="Colorful List Accent 4" w:uiPriority="72"/>
+    <w:lsdException w:name="Colorful Grid Accent 4" w:uiPriority="73"/>
+    <w:lsdException w:name="Light Shading Accent 5" w:uiPriority="60"/>
+    <w:lsdException w:name="Light List Accent 5" w:uiPriority="61"/>
+    <w:lsdException w:name="Light Grid Accent 5" w:uiPriority="62"/>
+    <w:lsdException w:name="Medium Shading 1 Accent 5" w:uiPriority="63"/>
+    <w:lsdException w:name="Medium Shading 2 Accent 5" w:uiPriority="64"/>
+    <w:lsdException w:name="Medium List 1 Accent 5" w:uiPriority="65"/>
+    <w:lsdException w:name="Medium List 2 Accent 5" w:uiPriority="66"/>
+    <w:lsdException w:name="Medium Grid 1 Accent 5" w:uiPriority="67"/>
+    <w:lsdException w:name="Medium Grid 2 Accent 5" w:uiPriority="68"/>
+    <w:lsdException w:name="Medium Grid 3 Accent 5" w:uiPriority="69"/>
+    <w:lsdException w:name="Dark List Accent 5" w:uiPriority="70"/>
+    <w:lsdException w:name="Colorful Shading Accent 5" w:uiPriority="71"/>
+    <w:lsdException w:name="Colorful List Accent 5" w:uiPriority="72"/>
+    <w:lsdException w:name="Colorful Grid Accent 5" w:uiPriority="73"/>
+    <w:lsdException w:name="Light Shading Accent 6" w:uiPriority="60"/>
+    <w:lsdException w:name="Light List Accent 6" w:uiPriority="61"/>
+    <w:lsdException w:name="Light Grid Accent 6" w:uiPriority="62"/>
+    <w:lsdException w:name="Medium Shading 1 Accent 6" w:uiPriority="63"/>
+    <w:lsdException w:name="Medium Shading 2 Accent 6" w:uiPriority="64"/>
+    <w:lsdException w:name="Medium List 1 Accent 6" w:uiPriority="65"/>
+    <w:lsdException w:name="Medium List 2 Accent 6" w:uiPriority="66"/>
+    <w:lsdException w:name="Medium Grid 1 Accent 6" w:uiPriority="67"/>
+    <w:lsdException w:name="Medium Grid 2 Accent 6" w:uiPriority="68"/>
+    <w:lsdException w:name="Medium Grid 3 Accent 6" w:uiPriority="69"/>
+    <w:lsdException w:name="Dark List Accent 6" w:uiPriority="70"/>
+    <w:lsdException w:name="Colorful Shading Accent 6" w:uiPriority="71"/>
+    <w:lsdException w:name="Colorful List Accent 6" w:uiPriority="72"/>
+    <w:lsdException w:name="Colorful Grid Accent 6" w:uiPriority="73"/>
+    <w:lsdException w:name="Subtle Emphasis" w:uiPriority="19" w:qFormat="1"/>
+    <w:lsdException w:name="Intense Emphasis" w:uiPriority="21" w:qFormat="1"/>
+    <w:lsdException w:name="Subtle Reference" w:uiPriority="31" w:qFormat="1"/>
+    <w:lsdException w:name="Intense Reference" w:uiPriority="32" w:qFormat="1"/>
+    <w:lsdException w:name="Book Title" w:uiPriority="33" w:qFormat="1"/>
+    <w:lsdException w:name="Bibliography" w:semiHidden="1" w:uiPriority="37" w:unhideWhenUsed="1"/>
+    <w:lsdException w:name="TOC Heading" w:semiHidden="1" w:uiPriority="39" w:unhideWhenUsed="1" w:qFormat="1"/>
+    <w:lsdException w:name="Plain Table 1" w:uiPriority="41"/>
+    <w:lsdException w:name="Plain Table 2" w:uiPriority="42"/>
+    <w:lsdException w:name="Plain Table 3" w:uiPriority="43"/>
+    <w:lsdException w:name="Plain Table 4" w:uiPriority="44"/>
+    <w:lsdException w:name="Plain Table 5" w:uiPriority="45"/>
+    <w:lsdException w:name="Grid Table Light" w:uiPriority="40"/>
+    <w:lsdException w:name="Grid Table 1 Light" w:uiPriority="46"/>
+    <w:lsdException w:name="Grid Table 2" w:uiPriority="47"/>
+    <w:lsdException w:name="Grid Table 3" w:uiPriority="48"/>
+    <w:lsdException w:name="Grid Table 4" w:uiPriority="49"/>
+    <w:lsdException w:name="Grid Table 5 Dark" w:uiPriority="50"/>
+    <w:lsdException w:name="Grid Table 6 Colorful" w:uiPriority="51"/>
+    <w:lsdException w:name="Grid Table 7 Colorful" w:uiPriority="52"/>
+    <w:lsdException w:name="Grid Table 1 Light Accent 1" w:uiPriority="46"/>
+    <w:lsdException w:name="Grid Table 2 Accent 1" w:uiPriority="47"/>
+    <w:lsdException w:name="Grid Table 3 Accent 1" w:uiPriority="48"/>
+    <w:lsdException w:name="Grid Table 4 Accent 1" w:uiPriority="49"/>
+    <w:lsdException w:name="Grid Table 5 Dark Accent 1" w:uiPriority="50"/>
+    <w:lsdException w:name="Grid Table 6 Colorful Accent 1" w:uiPriority="51"/>
+    <w:lsdException w:name="Grid Table 7 Colorful Accent 1" w:uiPriority="52"/>
+    <w:lsdException w:name="Grid Table 1 Light Accent 2" w:uiPriority="46"/>
+    <w:lsdException w:name="Grid Table 2 Accent 2" w:uiPriority="47"/>
+    <w:lsdException w:name="Grid Table 3 Accent 2" w:uiPriority="48"/>
+    <w:lsdException w:name="Grid Table 4 Accent 2" w:uiPriority="49"/>
+    <w:lsdException w:name="Grid Table 5 Dark Accent 2" w:uiPriority="50"/>
+    <w:lsdException w:name="Grid Table 6 Colorful Accent 2" w:uiPriority="51"/>
+    <w:lsdException w:name="Grid Table 7 Colorful Accent 2" w:uiPriority="52"/>
+    <w:lsdException w:name="Grid Table 1 Light Accent 3" w:uiPriority="46"/>
+    <w:lsdException w:name="Grid Table 2 Accent 3" w:uiPriority="47"/>
+    <w:lsdException w:name="Grid Table 3 Accent 3" w:uiPriority="48"/>
+    <w:lsdException w:name="Grid Table 4 Accent 3" w:uiPriority="49"/>
+    <w:lsdException w:name="Grid Table 5 Dark Accent 3" w:uiPriority="50"/>
+    <w:lsdException w:name="Grid Table 6 Colorful Accent 3" w:uiPriority="51"/>
+    <w:lsdException w:name="Grid Table 7 Colorful Accent 3" w:uiPriority="52"/>
+    <w:lsdException w:name="Grid Table 1 Light Accent 4" w:uiPriority="46"/>
+    <w:lsdException w:name="Grid Table 2 Accent 4" w:uiPriority="47"/>
+    <w:lsdException w:name="Grid Table 3 Accent 4" w:uiPriority="48"/>
+    <w:lsdException w:name="Grid Table 4 Accent 4" w:uiPriority="49"/>
+    <w:lsdException w:name="Grid Table 5 Dark Accent 4" w:uiPriority="50"/>
+    <w:lsdException w:name="Grid Table 6 Colorful Accent 4" w:uiPriority="51"/>
+    <w:lsdException w:name="Grid Table 7 Colorful Accent 4" w:uiPriority="52"/>
+    <w:lsdException w:name="Grid Table 1 Light Accent 5" w:uiPriority="46"/>
+    <w:lsdException w:name="Grid Table 2 Accent 5" w:uiPriority="47"/>
+    <w:lsdException w:name="Grid Table 3 Accent 5" w:uiPriority="48"/>
+    <w:lsdException w:name="Grid Table 4 Accent 5" w:uiPriority="49"/>
+    <w:lsdException w:name="Grid Table 5 Dark Accent 5" w:uiPriority="50"/>
+    <w:lsdException w:name="Grid Table 6 Colorful Accent 5" w:uiPriority="51"/>
+    <w:lsdException w:name="Grid Table 7 Colorful Accent 5" w:uiPriority="52"/>
+    <w:lsdException w:name="Grid Table 1 Light Accent 6" w:uiPriority="46"/>
+    <w:lsdException w:name="Grid Table 2 Accent 6" w:uiPriority="47"/>
+    <w:lsdException w:name="Grid Table 3 Accent 6" w:uiPriority="48"/>
+    <w:lsdException w:name="Grid Table 4 Accent 6" w:uiPriority="49"/>
+    <w:lsdException w:name="Grid Table 5 Dark Accent 6" w:uiPriority="50"/>
+    <w:lsdException w:name="Grid Table 6 Colorful Accent 6" w:uiPriority="51"/>
+    <w:lsdException w:name="Grid Table 7 Colorful Accent 6" w:uiPriority="52"/>
+    <w:lsdException w:name="List Table 1 Light" w:uiPriority="46"/>
+    <w:lsdException w:name="List Table 2" w:uiPriority="47"/>
+    <w:lsdException w:name="List Table 3" w:uiPriority="48"/>
+    <w:lsdException w:name="List Table 4" w:uiPriority="49"/>
+    <w:lsdException w:name="List Table 5 Dark" w:uiPriority="50"/>
+    <w:lsdException w:name="List Table 6 Colorful" w:uiPriority="51"/>
+    <w:lsdException w:name="List Table 7 Colorful" w:uiPriority="52"/>
+    <w:lsdException w:name="List Table 1 Light Accent 1" w:uiPriority="46"/>
+    <w:lsdException w:name="List Table 2 Accent 1" w:uiPriority="47"/>
+    <w:lsdException w:name="List Table 3 Accent 1" w:uiPriority="48"/>
+    <w:lsdException w:name="List Table 4 Accent 1" w:uiPriority="49"/>
+    <w:lsdException w:name="List Table 5 Dark Accent 1" w:uiPriority="50"/>
+    <w:lsdException w:name="List Table 6 Colorful Accent 1" w:uiPriority="51"/>
+    <w:lsdException w:name="List Table 7 Colorful Accent 1" w:uiPriority="52"/>
+    <w:lsdException w:name="List Table 1 Light Accent 2" w:uiPriority="46"/>
+    <w:lsdException w:name="List Table 2 Accent 2" w:uiPriority="47"/>
+    <w:lsdException w:name="List Table 3 Accent 2" w:uiPriority="48"/>
+    <w:lsdException w:name="List Table 4 Accent 2" w:uiPriority="49"/>
+    <w:lsdException w:name="List Table 5 Dark Accent 2" w:uiPriority="50"/>
+    <w:lsdException w:name="List Table 6 Colorful Accent 2" w:uiPriority="51"/>
+    <w:lsdException w:name="List Table 7 Colorful Accent 2" w:uiPriority="52"/>
+    <w:lsdException w:name="List Table 1 Light Accent 3" w:uiPriority="46"/>
+    <w:lsdException w:name="List Table 2 Accent 3" w:uiPriority="47"/>
+    <w:lsdException w:name="List Table 3 Accent 3" w:uiPriority="48"/>
+    <w:lsdException w:name="List Table 4 Accent 3" w:uiPriority="49"/>
+    <w:lsdException w:name="List Table 5 Dark Accent 3" w:uiPriority="50"/>
+    <w:lsdException w:name="List Table 6 Colorful Accent 3" w:uiPriority="51"/>
+    <w:lsdException w:name="List Table 7 Colorful Accent 3" w:uiPriority="52"/>
+    <w:lsdException w:name="List Table 1 Light Accent 4" w:uiPriority="46"/>
+    <w:lsdException w:name="List Table 2 Accent 4" w:uiPriority="47"/>
+    <w:lsdException w:name="List Table 3 Accent 4" w:uiPriority="48"/>
+    <w:lsdException w:name="List Table 4 Accent 4" w:uiPriority="49"/>
+    <w:lsdException w:name="List Table 5 Dark Accent 4" w:uiPriority="50"/>
+    <w:lsdException w:name="List Table 6 Colorful Accent 4" w:uiPriority="51"/>
+    <w:lsdException w:name="List Table 7 Colorful Accent 4" w:uiPriority="52"/>
+    <w:lsdException w:name="List Table 1 Light Accent 5" w:uiPriority="46"/>
+    <w:lsdException w:name="List Table 2 Accent 5" w:uiPriority="47"/>
+    <w:lsdException w:name="List Table 3 Accent 5" w:uiPriority="48"/>
+    <w:lsdException w:name="List Table 4 Accent 5" w:uiPriority="49"/>
+    <w:lsdException w:name="List Table 5 Dark Accent 5" w:uiPriority="50"/>
+    <w:lsdException w:name="List Table 6 Colorful Accent 5" w:uiPriority="51"/>
+    <w:lsdException w:name="List Table 7 Colorful Accent 5" w:uiPriority="52"/>
+    <w:lsdException w:name="List Table 1 Light Accent 6" w:uiPriority="46"/>
+    <w:lsdException w:name="List Table 2 Accent 6" w:uiPriority="47"/>
+    <w:lsdException w:name="List Table 3 Accent 6" w:uiPriority="48"/>
+    <w:lsdException w:name="List Table 4 Accent 6" w:uiPriority="49"/>
+    <w:lsdException w:name="List Table 5 Dark Accent 6" w:uiPriority="50"/>
+    <w:lsdException w:name="List Table 6 Colorful Accent 6" w:uiPriority="51"/>
+    <w:lsdException w:name="List Table 7 Colorful Accent 6" w:uiPriority="52"/>
+    <w:lsdException w:name="Mention" w:semiHidden="1" w:unhideWhenUsed="1"/>
+    <w:lsdException w:name="Smart Hyperlink" w:semiHidden="1" w:unhideWhenUsed="1"/>
+    <w:lsdException w:name="Hashtag" w:semiHidden="1" w:unhideWhenUsed="1"/>
+    <w:lsdException w:name="Unresolved Mention" w:semiHidden="1" w:unhideWhenUsed="1"/>
+    <w:lsdException w:name="Smart Link" w:semiHidden="1" w:unhideWhenUsed="1"/>
+  </w:latentStyles>
+  <w:style w:type="paragraph" w:default="1" w:styleId="Normal">
+    <w:name w:val="Normal"/>
+    <w:qFormat/>
+    <w:rPr>
+      <w:rFonts w:ascii="Arial MT" w:eastAsia="Arial MT" w:hAnsi="Arial MT" w:cs="Arial MT"/>
+    </w:rPr>
+  </w:style>
+  <w:style w:type="character" w:default="1" w:styleId="DefaultParagraphFont">
     <w:name w:val="Default Paragraph Font"/>
     <w:uiPriority w:val="1"/>
+    <w:unhideWhenUsed/>
+  </w:style>
+  <w:style w:type="table" w:default="1" w:styleId="TableNormal">
+    <w:name w:val="Normal Table"/>
+    <w:uiPriority w:val="99"/>
     <w:semiHidden/>
     <w:unhideWhenUsed/>
-  </w:style>
-  <w:style w:styleId="TableNormal" w:default="1" w:type="table">
-    <w:name w:val="Table Normal"/>
-    <w:uiPriority w:val="2"/>
-    <w:semiHidden/>
-    <w:unhideWhenUsed/>
-    <w:qFormat/>
     <w:tblPr>
       <w:tblInd w:w="0" w:type="dxa"/>
       <w:tblCellMar>
         <w:top w:w="0" w:type="dxa"/>
-        <w:left w:w="0" w:type="dxa"/>
+        <w:left w:w="108" w:type="dxa"/>
         <w:bottom w:w="0" w:type="dxa"/>
-        <w:right w:w="0" w:type="dxa"/>
+        <w:right w:w="108" w:type="dxa"/>
       </w:tblCellMar>
     </w:tblPr>
   </w:style>
-  <w:style w:styleId="NoList" w:default="1" w:type="numbering">
+  <w:style w:type="numbering" w:default="1" w:styleId="NoList">
     <w:name w:val="No List"/>
     <w:uiPriority w:val="99"/>
     <w:semiHidden/>
     <w:unhideWhenUsed/>
   </w:style>
-  <w:style w:default="1" w:styleId="Normal" w:type="paragraph">
-    <w:name w:val="Normal"/>
-    <w:uiPriority w:val="1"/>
-    <w:qFormat/>
-    <w:pPr/>
-    <w:rPr>
-      <w:rFonts w:ascii="Arial MT" w:hAnsi="Arial MT" w:eastAsia="Arial MT" w:cs="Arial MT"/>
-      <w:lang w:val="en-US" w:eastAsia="en-US" w:bidi="ar-SA"/>
-    </w:rPr>
-  </w:style>
-  <w:style w:styleId="BodyText" w:type="paragraph">
+  <w:style w:type="paragraph" w:styleId="BodyText">
     <w:name w:val="Body Text"/>
     <w:basedOn w:val="Normal"/>
     <w:uiPriority w:val="1"/>
     <w:qFormat/>
-    <w:pPr/>
     <w:rPr>
-      <w:rFonts w:ascii="Arial MT" w:hAnsi="Arial MT" w:eastAsia="Arial MT" w:cs="Arial MT"/>
       <w:sz w:val="21"/>
       <w:szCs w:val="21"/>
-      <w:lang w:val="en-US" w:eastAsia="en-US" w:bidi="ar-SA"/>
     </w:rPr>
   </w:style>
-  <w:style w:styleId="Title" w:type="paragraph">
+  <w:style w:type="paragraph" w:styleId="Title">
     <w:name w:val="Title"/>
     <w:basedOn w:val="Normal"/>
-    <w:uiPriority w:val="1"/>
+    <w:uiPriority w:val="10"/>
     <w:qFormat/>
     <w:pPr>
       <w:spacing w:before="68" w:after="2"/>
       <w:ind w:left="146"/>
     </w:pPr>
     <w:rPr>
-      <w:rFonts w:ascii="Arial" w:hAnsi="Arial" w:eastAsia="Arial" w:cs="Arial"/>
+      <w:rFonts w:ascii="Arial" w:eastAsia="Arial" w:hAnsi="Arial" w:cs="Arial"/>
       <w:b/>
       <w:bCs/>
       <w:sz w:val="27"/>
       <w:szCs w:val="27"/>
-      <w:lang w:val="en-US" w:eastAsia="en-US" w:bidi="ar-SA"/>
     </w:rPr>
   </w:style>
-  <w:style w:styleId="ListParagraph" w:type="paragraph">
+  <w:style w:type="paragraph" w:styleId="ListParagraph">
     <w:name w:val="List Paragraph"/>
     <w:basedOn w:val="Normal"/>
     <w:uiPriority w:val="1"/>
     <w:qFormat/>
-    <w:pPr/>
-    <w:rPr>
-      <w:lang w:val="en-US" w:eastAsia="en-US" w:bidi="ar-SA"/>
-    </w:rPr>
   </w:style>
-  <w:style w:styleId="TableParagraph" w:type="paragraph">
+  <w:style w:type="paragraph" w:customStyle="1" w:styleId="TableParagraph">
     <w:name w:val="Table Paragraph"/>
     <w:basedOn w:val="Normal"/>
     <w:uiPriority w:val="1"/>
@@ -5730,10 +6101,6 @@
     <w:pPr>
       <w:ind w:left="152"/>
     </w:pPr>
-    <w:rPr>
-      <w:rFonts w:ascii="Arial MT" w:hAnsi="Arial MT" w:eastAsia="Arial MT" w:cs="Arial MT"/>
-      <w:lang w:val="en-US" w:eastAsia="en-US" w:bidi="ar-SA"/>
-    </w:rPr>
   </w:style>
 </w:styles>
 </file>

</xml_diff>